<commit_message>
docs: add end-to-end UI test report documentation and generation scripts
</commit_message>
<xml_diff>
--- a/documentation/docx/heardesk-end-to-end-ui-test-report.docx
+++ b/documentation/docx/heardesk-end-to-end-ui-test-report.docx
@@ -43,7 +43,7 @@
     </w:p>
     <w:p>
       <w:r>
-        <w:t>Version 1.0  •  13 October 2026</w:t>
+        <w:t>Version 1.0  •  14 October 2026</w:t>
       </w:r>
     </w:p>
     <w:p>
@@ -63,7 +63,7 @@
       <w:pPr>
         <w:pStyle w:val="Heading1"/>
       </w:pPr>
-      <w:bookmarkStart w:id="0" w:name="_Toc242791538"/>
+      <w:bookmarkStart w:id="0" w:name="_Toc242876782"/>
       <w:r>
         <w:lastRenderedPageBreak/>
         <w:t>Contents</w:t>
@@ -93,7 +93,7 @@
       <w:r>
         <w:fldChar w:fldCharType="separate"/>
       </w:r>
-      <w:hyperlink w:anchor="_Toc242791538" w:history="1">
+      <w:hyperlink w:anchor="_Toc242876782" w:history="1">
         <w:r>
           <w:rPr>
             <w:rStyle w:val="Hyperlink"/>
@@ -120,7 +120,7 @@
             <w:noProof/>
             <w:webHidden/>
           </w:rPr>
-          <w:instrText xml:space="preserve"> PAGEREF _Toc242791538 \h </w:instrText>
+          <w:instrText xml:space="preserve"> PAGEREF _Toc242876782 \h </w:instrText>
         </w:r>
         <w:r>
           <w:rPr>
@@ -165,7 +165,7 @@
           <w:lang w:val="en-ID" w:eastAsia="en-ID"/>
         </w:rPr>
       </w:pPr>
-      <w:hyperlink w:anchor="_Toc242791539" w:history="1">
+      <w:hyperlink w:anchor="_Toc242876783" w:history="1">
         <w:r>
           <w:rPr>
             <w:rStyle w:val="Hyperlink"/>
@@ -192,7 +192,7 @@
             <w:noProof/>
             <w:webHidden/>
           </w:rPr>
-          <w:instrText xml:space="preserve"> PAGEREF _Toc242791539 \h </w:instrText>
+          <w:instrText xml:space="preserve"> PAGEREF _Toc242876783 \h </w:instrText>
         </w:r>
         <w:r>
           <w:rPr>
@@ -237,7 +237,7 @@
           <w:lang w:val="en-ID" w:eastAsia="en-ID"/>
         </w:rPr>
       </w:pPr>
-      <w:hyperlink w:anchor="_Toc242791540" w:history="1">
+      <w:hyperlink w:anchor="_Toc242876784" w:history="1">
         <w:r>
           <w:rPr>
             <w:rStyle w:val="Hyperlink"/>
@@ -264,7 +264,7 @@
             <w:noProof/>
             <w:webHidden/>
           </w:rPr>
-          <w:instrText xml:space="preserve"> PAGEREF _Toc242791540 \h </w:instrText>
+          <w:instrText xml:space="preserve"> PAGEREF _Toc242876784 \h </w:instrText>
         </w:r>
         <w:r>
           <w:rPr>
@@ -309,7 +309,7 @@
           <w:lang w:val="en-ID" w:eastAsia="en-ID"/>
         </w:rPr>
       </w:pPr>
-      <w:hyperlink w:anchor="_Toc242791541" w:history="1">
+      <w:hyperlink w:anchor="_Toc242876785" w:history="1">
         <w:r>
           <w:rPr>
             <w:rStyle w:val="Hyperlink"/>
@@ -336,7 +336,7 @@
             <w:noProof/>
             <w:webHidden/>
           </w:rPr>
-          <w:instrText xml:space="preserve"> PAGEREF _Toc242791541 \h </w:instrText>
+          <w:instrText xml:space="preserve"> PAGEREF _Toc242876785 \h </w:instrText>
         </w:r>
         <w:r>
           <w:rPr>
@@ -381,7 +381,7 @@
           <w:lang w:val="en-ID" w:eastAsia="en-ID"/>
         </w:rPr>
       </w:pPr>
-      <w:hyperlink w:anchor="_Toc242791542" w:history="1">
+      <w:hyperlink w:anchor="_Toc242876786" w:history="1">
         <w:r>
           <w:rPr>
             <w:rStyle w:val="Hyperlink"/>
@@ -408,7 +408,7 @@
             <w:noProof/>
             <w:webHidden/>
           </w:rPr>
-          <w:instrText xml:space="preserve"> PAGEREF _Toc242791542 \h </w:instrText>
+          <w:instrText xml:space="preserve"> PAGEREF _Toc242876786 \h </w:instrText>
         </w:r>
         <w:r>
           <w:rPr>
@@ -453,7 +453,7 @@
           <w:lang w:val="en-ID" w:eastAsia="en-ID"/>
         </w:rPr>
       </w:pPr>
-      <w:hyperlink w:anchor="_Toc242791543" w:history="1">
+      <w:hyperlink w:anchor="_Toc242876787" w:history="1">
         <w:r>
           <w:rPr>
             <w:rStyle w:val="Hyperlink"/>
@@ -480,7 +480,7 @@
             <w:noProof/>
             <w:webHidden/>
           </w:rPr>
-          <w:instrText xml:space="preserve"> PAGEREF _Toc242791543 \h </w:instrText>
+          <w:instrText xml:space="preserve"> PAGEREF _Toc242876787 \h </w:instrText>
         </w:r>
         <w:r>
           <w:rPr>
@@ -525,7 +525,7 @@
           <w:lang w:val="en-ID" w:eastAsia="en-ID"/>
         </w:rPr>
       </w:pPr>
-      <w:hyperlink w:anchor="_Toc242791544" w:history="1">
+      <w:hyperlink w:anchor="_Toc242876788" w:history="1">
         <w:r>
           <w:rPr>
             <w:rStyle w:val="Hyperlink"/>
@@ -552,7 +552,7 @@
             <w:noProof/>
             <w:webHidden/>
           </w:rPr>
-          <w:instrText xml:space="preserve"> PAGEREF _Toc242791544 \h </w:instrText>
+          <w:instrText xml:space="preserve"> PAGEREF _Toc242876788 \h </w:instrText>
         </w:r>
         <w:r>
           <w:rPr>
@@ -597,7 +597,7 @@
           <w:lang w:val="en-ID" w:eastAsia="en-ID"/>
         </w:rPr>
       </w:pPr>
-      <w:hyperlink w:anchor="_Toc242791545" w:history="1">
+      <w:hyperlink w:anchor="_Toc242876789" w:history="1">
         <w:r>
           <w:rPr>
             <w:rStyle w:val="Hyperlink"/>
@@ -624,7 +624,7 @@
             <w:noProof/>
             <w:webHidden/>
           </w:rPr>
-          <w:instrText xml:space="preserve"> PAGEREF _Toc242791545 \h </w:instrText>
+          <w:instrText xml:space="preserve"> PAGEREF _Toc242876789 \h </w:instrText>
         </w:r>
         <w:r>
           <w:rPr>
@@ -669,13 +669,13 @@
           <w:lang w:val="en-ID" w:eastAsia="en-ID"/>
         </w:rPr>
       </w:pPr>
-      <w:hyperlink w:anchor="_Toc242791546" w:history="1">
+      <w:hyperlink w:anchor="_Toc242876790" w:history="1">
         <w:r>
           <w:rPr>
             <w:rStyle w:val="Hyperlink"/>
             <w:noProof/>
           </w:rPr>
-          <w:t>8. Recorded scenario results</w:t>
+          <w:t>8. Test results</w:t>
         </w:r>
         <w:r>
           <w:rPr>
@@ -696,7 +696,7 @@
             <w:noProof/>
             <w:webHidden/>
           </w:rPr>
-          <w:instrText xml:space="preserve"> PAGEREF _Toc242791546 \h </w:instrText>
+          <w:instrText xml:space="preserve"> PAGEREF _Toc242876790 \h </w:instrText>
         </w:r>
         <w:r>
           <w:rPr>
@@ -741,7 +741,7 @@
           <w:lang w:val="en-ID" w:eastAsia="en-ID"/>
         </w:rPr>
       </w:pPr>
-      <w:hyperlink w:anchor="_Toc242791547" w:history="1">
+      <w:hyperlink w:anchor="_Toc242876791" w:history="1">
         <w:r>
           <w:rPr>
             <w:rStyle w:val="Hyperlink"/>
@@ -768,7 +768,79 @@
             <w:noProof/>
             <w:webHidden/>
           </w:rPr>
-          <w:instrText xml:space="preserve"> PAGEREF _Toc242791547 \h </w:instrText>
+          <w:instrText xml:space="preserve"> PAGEREF _Toc242876791 \h </w:instrText>
+        </w:r>
+        <w:r>
+          <w:rPr>
+            <w:noProof/>
+            <w:webHidden/>
+          </w:rPr>
+        </w:r>
+        <w:r>
+          <w:rPr>
+            <w:noProof/>
+            <w:webHidden/>
+          </w:rPr>
+          <w:fldChar w:fldCharType="separate"/>
+        </w:r>
+        <w:r>
+          <w:rPr>
+            <w:noProof/>
+            <w:webHidden/>
+          </w:rPr>
+          <w:t>7</w:t>
+        </w:r>
+        <w:r>
+          <w:rPr>
+            <w:noProof/>
+            <w:webHidden/>
+          </w:rPr>
+          <w:fldChar w:fldCharType="end"/>
+        </w:r>
+      </w:hyperlink>
+    </w:p>
+    <w:p>
+      <w:pPr>
+        <w:pStyle w:val="TOC1"/>
+        <w:tabs>
+          <w:tab w:val="right" w:leader="dot" w:pos="9514"/>
+        </w:tabs>
+        <w:rPr>
+          <w:rFonts w:asciiTheme="minorHAnsi" w:hAnsiTheme="minorHAnsi"/>
+          <w:noProof/>
+          <w:color w:val="auto"/>
+          <w:sz w:val="22"/>
+          <w:lang w:val="en-ID" w:eastAsia="en-ID"/>
+        </w:rPr>
+      </w:pPr>
+      <w:hyperlink w:anchor="_Toc242876792" w:history="1">
+        <w:r>
+          <w:rPr>
+            <w:rStyle w:val="Hyperlink"/>
+            <w:noProof/>
+          </w:rPr>
+          <w:t>10. Screenshot: team inbox</w:t>
+        </w:r>
+        <w:r>
+          <w:rPr>
+            <w:noProof/>
+            <w:webHidden/>
+          </w:rPr>
+          <w:tab/>
+        </w:r>
+        <w:r>
+          <w:rPr>
+            <w:noProof/>
+            <w:webHidden/>
+          </w:rPr>
+          <w:fldChar w:fldCharType="begin"/>
+        </w:r>
+        <w:r>
+          <w:rPr>
+            <w:noProof/>
+            <w:webHidden/>
+          </w:rPr>
+          <w:instrText xml:space="preserve"> PAGEREF _Toc242876792 \h </w:instrText>
         </w:r>
         <w:r>
           <w:rPr>
@@ -813,13 +885,13 @@
           <w:lang w:val="en-ID" w:eastAsia="en-ID"/>
         </w:rPr>
       </w:pPr>
-      <w:hyperlink w:anchor="_Toc242791548" w:history="1">
+      <w:hyperlink w:anchor="_Toc242876793" w:history="1">
         <w:r>
           <w:rPr>
             <w:rStyle w:val="Hyperlink"/>
             <w:noProof/>
           </w:rPr>
-          <w:t>10. Screenshot: team inbox</w:t>
+          <w:t>11. Screenshot: visitor widget</w:t>
         </w:r>
         <w:r>
           <w:rPr>
@@ -840,7 +912,7 @@
             <w:noProof/>
             <w:webHidden/>
           </w:rPr>
-          <w:instrText xml:space="preserve"> PAGEREF _Toc242791548 \h </w:instrText>
+          <w:instrText xml:space="preserve"> PAGEREF _Toc242876793 \h </w:instrText>
         </w:r>
         <w:r>
           <w:rPr>
@@ -885,13 +957,13 @@
           <w:lang w:val="en-ID" w:eastAsia="en-ID"/>
         </w:rPr>
       </w:pPr>
-      <w:hyperlink w:anchor="_Toc242791549" w:history="1">
+      <w:hyperlink w:anchor="_Toc242876794" w:history="1">
         <w:r>
           <w:rPr>
             <w:rStyle w:val="Hyperlink"/>
             <w:noProof/>
           </w:rPr>
-          <w:t>11. Screenshot: visitor widget</w:t>
+          <w:t>12. What the results establish</w:t>
         </w:r>
         <w:r>
           <w:rPr>
@@ -912,7 +984,79 @@
             <w:noProof/>
             <w:webHidden/>
           </w:rPr>
-          <w:instrText xml:space="preserve"> PAGEREF _Toc242791549 \h </w:instrText>
+          <w:instrText xml:space="preserve"> PAGEREF _Toc242876794 \h </w:instrText>
+        </w:r>
+        <w:r>
+          <w:rPr>
+            <w:noProof/>
+            <w:webHidden/>
+          </w:rPr>
+        </w:r>
+        <w:r>
+          <w:rPr>
+            <w:noProof/>
+            <w:webHidden/>
+          </w:rPr>
+          <w:fldChar w:fldCharType="separate"/>
+        </w:r>
+        <w:r>
+          <w:rPr>
+            <w:noProof/>
+            <w:webHidden/>
+          </w:rPr>
+          <w:t>9</w:t>
+        </w:r>
+        <w:r>
+          <w:rPr>
+            <w:noProof/>
+            <w:webHidden/>
+          </w:rPr>
+          <w:fldChar w:fldCharType="end"/>
+        </w:r>
+      </w:hyperlink>
+    </w:p>
+    <w:p>
+      <w:pPr>
+        <w:pStyle w:val="TOC1"/>
+        <w:tabs>
+          <w:tab w:val="right" w:leader="dot" w:pos="9514"/>
+        </w:tabs>
+        <w:rPr>
+          <w:rFonts w:asciiTheme="minorHAnsi" w:hAnsiTheme="minorHAnsi"/>
+          <w:noProof/>
+          <w:color w:val="auto"/>
+          <w:sz w:val="22"/>
+          <w:lang w:val="en-ID" w:eastAsia="en-ID"/>
+        </w:rPr>
+      </w:pPr>
+      <w:hyperlink w:anchor="_Toc242876795" w:history="1">
+        <w:r>
+          <w:rPr>
+            <w:rStyle w:val="Hyperlink"/>
+            <w:noProof/>
+          </w:rPr>
+          <w:t>13. How to maintain this report</w:t>
+        </w:r>
+        <w:r>
+          <w:rPr>
+            <w:noProof/>
+            <w:webHidden/>
+          </w:rPr>
+          <w:tab/>
+        </w:r>
+        <w:r>
+          <w:rPr>
+            <w:noProof/>
+            <w:webHidden/>
+          </w:rPr>
+          <w:fldChar w:fldCharType="begin"/>
+        </w:r>
+        <w:r>
+          <w:rPr>
+            <w:noProof/>
+            <w:webHidden/>
+          </w:rPr>
+          <w:instrText xml:space="preserve"> PAGEREF _Toc242876795 \h </w:instrText>
         </w:r>
         <w:r>
           <w:rPr>
@@ -957,13 +1101,13 @@
           <w:lang w:val="en-ID" w:eastAsia="en-ID"/>
         </w:rPr>
       </w:pPr>
-      <w:hyperlink w:anchor="_Toc242791550" w:history="1">
+      <w:hyperlink w:anchor="_Toc242876796" w:history="1">
         <w:r>
           <w:rPr>
             <w:rStyle w:val="Hyperlink"/>
             <w:noProof/>
           </w:rPr>
-          <w:t>12. What the results establish</w:t>
+          <w:t>14. Test source references</w:t>
         </w:r>
         <w:r>
           <w:rPr>
@@ -984,79 +1128,7 @@
             <w:noProof/>
             <w:webHidden/>
           </w:rPr>
-          <w:instrText xml:space="preserve"> PAGEREF _Toc242791550 \h </w:instrText>
-        </w:r>
-        <w:r>
-          <w:rPr>
-            <w:noProof/>
-            <w:webHidden/>
-          </w:rPr>
-        </w:r>
-        <w:r>
-          <w:rPr>
-            <w:noProof/>
-            <w:webHidden/>
-          </w:rPr>
-          <w:fldChar w:fldCharType="separate"/>
-        </w:r>
-        <w:r>
-          <w:rPr>
-            <w:noProof/>
-            <w:webHidden/>
-          </w:rPr>
-          <w:t>10</w:t>
-        </w:r>
-        <w:r>
-          <w:rPr>
-            <w:noProof/>
-            <w:webHidden/>
-          </w:rPr>
-          <w:fldChar w:fldCharType="end"/>
-        </w:r>
-      </w:hyperlink>
-    </w:p>
-    <w:p>
-      <w:pPr>
-        <w:pStyle w:val="TOC1"/>
-        <w:tabs>
-          <w:tab w:val="right" w:leader="dot" w:pos="9514"/>
-        </w:tabs>
-        <w:rPr>
-          <w:rFonts w:asciiTheme="minorHAnsi" w:hAnsiTheme="minorHAnsi"/>
-          <w:noProof/>
-          <w:color w:val="auto"/>
-          <w:sz w:val="22"/>
-          <w:lang w:val="en-ID" w:eastAsia="en-ID"/>
-        </w:rPr>
-      </w:pPr>
-      <w:hyperlink w:anchor="_Toc242791551" w:history="1">
-        <w:r>
-          <w:rPr>
-            <w:rStyle w:val="Hyperlink"/>
-            <w:noProof/>
-          </w:rPr>
-          <w:t>13. How to maintain this report</w:t>
-        </w:r>
-        <w:r>
-          <w:rPr>
-            <w:noProof/>
-            <w:webHidden/>
-          </w:rPr>
-          <w:tab/>
-        </w:r>
-        <w:r>
-          <w:rPr>
-            <w:noProof/>
-            <w:webHidden/>
-          </w:rPr>
-          <w:fldChar w:fldCharType="begin"/>
-        </w:r>
-        <w:r>
-          <w:rPr>
-            <w:noProof/>
-            <w:webHidden/>
-          </w:rPr>
-          <w:instrText xml:space="preserve"> PAGEREF _Toc242791551 \h </w:instrText>
+          <w:instrText xml:space="preserve"> PAGEREF _Toc242876796 \h </w:instrText>
         </w:r>
         <w:r>
           <w:rPr>
@@ -1101,7 +1173,7 @@
       <w:pPr>
         <w:pStyle w:val="Heading1"/>
       </w:pPr>
-      <w:bookmarkStart w:id="1" w:name="_Toc242791539"/>
+      <w:bookmarkStart w:id="1" w:name="_Toc242876783"/>
       <w:r>
         <w:lastRenderedPageBreak/>
         <w:t>1. Purpose and recorded version</w:t>
@@ -1144,7 +1216,7 @@
       <w:pPr>
         <w:pStyle w:val="Heading1"/>
       </w:pPr>
-      <w:bookmarkStart w:id="2" w:name="_Toc242791540"/>
+      <w:bookmarkStart w:id="2" w:name="_Toc242876784"/>
       <w:r>
         <w:t>2. Test environment</w:t>
       </w:r>
@@ -1555,7 +1627,7 @@
       <w:pPr>
         <w:pStyle w:val="Heading1"/>
       </w:pPr>
-      <w:bookmarkStart w:id="3" w:name="_Toc242791541"/>
+      <w:bookmarkStart w:id="3" w:name="_Toc242876785"/>
       <w:r>
         <w:t>3. How the tests were run</w:t>
       </w:r>
@@ -1589,7 +1661,7 @@
       <w:pPr>
         <w:pStyle w:val="Heading1"/>
       </w:pPr>
-      <w:bookmarkStart w:id="4" w:name="_Toc242791542"/>
+      <w:bookmarkStart w:id="4" w:name="_Toc242876786"/>
       <w:r>
         <w:lastRenderedPageBreak/>
         <w:t>4. Features covered by the browser tests</w:t>
@@ -2165,7 +2237,7 @@
       <w:pPr>
         <w:pStyle w:val="Heading1"/>
       </w:pPr>
-      <w:bookmarkStart w:id="5" w:name="_Toc242791543"/>
+      <w:bookmarkStart w:id="5" w:name="_Toc242876787"/>
       <w:r>
         <w:t>5. UI test UC-01: send feedback and save tracking access</w:t>
       </w:r>
@@ -2204,7 +2276,7 @@
       <w:pPr>
         <w:pStyle w:val="Heading1"/>
       </w:pPr>
-      <w:bookmarkStart w:id="6" w:name="_Toc242791544"/>
+      <w:bookmarkStart w:id="6" w:name="_Toc242876788"/>
       <w:r>
         <w:t>6. UI test UC-02: read team replies without seeing internal notes</w:t>
       </w:r>
@@ -2250,7 +2322,7 @@
           <w:noProof/>
         </w:rPr>
         <w:drawing>
-          <wp:inline distT="0" distB="0" distL="0" distR="0" wp14:anchorId="39247E4B" wp14:editId="480DE5ED">
+          <wp:inline distT="0" distB="0" distL="0" distR="0" wp14:anchorId="676E93F8" wp14:editId="182F780C">
             <wp:extent cx="5989320" cy="3850277"/>
             <wp:effectExtent l="0" t="0" r="0" b="0"/>
             <wp:docPr id="1" name="Picture 1" descr="UI test UC-02: read team replies without seeing internal notes"/>
@@ -2298,7 +2370,7 @@
       <w:pPr>
         <w:pStyle w:val="Heading1"/>
       </w:pPr>
-      <w:bookmarkStart w:id="7" w:name="_Toc242791545"/>
+      <w:bookmarkStart w:id="7" w:name="_Toc242876789"/>
       <w:r>
         <w:t>7. UI test UC-03: dialogs, loading and screen sizes</w:t>
       </w:r>
@@ -2333,35 +2405,37 @@
         <w:pStyle w:val="Heading1"/>
         <w:pageBreakBefore/>
       </w:pPr>
-      <w:bookmarkStart w:id="8" w:name="_Toc242791546"/>
+      <w:bookmarkStart w:id="8" w:name="_Toc242876790"/>
       <w:r>
         <w:lastRenderedPageBreak/>
-        <w:t>8. Recorded scenario results</w:t>
+        <w:t>8. Test results</w:t>
       </w:r>
       <w:bookmarkEnd w:id="8"/>
     </w:p>
     <w:p>
       <w:r>
-        <w:t>PASSED means that every assertion in that scenario succeeded during the recorded run. A skipped scenario did not run</w:t>
+        <w:t>All 19 scenarios passed. A scenario is marked Passed when all checks in its automated test succeed. No scenarios failed unexpecte</w:t>
       </w:r>
       <w:r>
-        <w:t>. A flaky result passes only after a failed attempt and retry. The recorded run had 19 passed scenarios, with no skipped, unexpected or flaky outcomes.</w:t>
+        <w:t>dly or were skipped, and none passed only after a retry.</w:t>
       </w:r>
     </w:p>
     <w:p>
       <w:r>
-        <w:t>Exact test names are retained below so each row can be found in the source. Some names contain developer</w:t>
-      </w:r>
-      <w:r>
-        <w:t xml:space="preserve"> terms such as payload (the data sent in a request) or legacy routes (older API paths kept for compatibility). The preceding workflow table explains them in user terms.</w:t>
+        <w:t>Table 3 summarizes the workflows and application behavior checked during this run. Section 14 lists the original test names and source files using the same scenario IDs.</w:t>
       </w:r>
     </w:p>
     <w:p>
       <w:r>
-        <w:t>Recorded start (UTC): 2026-10-13T04:14:49.928Z. Duration: 113.0 seconds. Results: 19 co</w:t>
+        <w:t xml:space="preserve">Run started: 13 October 2026 </w:t>
       </w:r>
       <w:r>
-        <w:t>mpleted as expected, 0 unexpected outcomes, 0 skipped and 0 flaky.</w:t>
+        <w:t>at 04:14:49.928 UTC.</w:t>
+      </w:r>
+    </w:p>
+    <w:p>
+      <w:r>
+        <w:t>Total duration: 113.0 seconds.</w:t>
       </w:r>
     </w:p>
     <w:p>
@@ -2370,19 +2444,20 @@
         <w:keepNext/>
       </w:pPr>
       <w:r>
-        <w:t>Table 3. Recorded scenario results</w:t>
+        <w:t>Table 3. Test results</w:t>
       </w:r>
     </w:p>
     <w:tbl>
       <w:tblPr>
         <w:tblStyle w:val="LightShading-Accent1"/>
         <w:tblW w:w="0" w:type="auto"/>
+        <w:tblLayout w:type="fixed"/>
         <w:tblLook w:val="04A0" w:firstRow="1" w:lastRow="0" w:firstColumn="1" w:lastColumn="0" w:noHBand="0" w:noVBand="1"/>
       </w:tblPr>
       <w:tblGrid>
-        <w:gridCol w:w="3175"/>
-        <w:gridCol w:w="3175"/>
-        <w:gridCol w:w="3175"/>
+        <w:gridCol w:w="964"/>
+        <w:gridCol w:w="6803"/>
+        <w:gridCol w:w="1757"/>
       </w:tblGrid>
       <w:tr>
         <w:trPr>
@@ -2392,47 +2467,47 @@
         <w:tc>
           <w:tcPr>
             <w:cnfStyle w:val="001000000000" w:firstRow="0" w:lastRow="0" w:firstColumn="1" w:lastColumn="0" w:oddVBand="0" w:evenVBand="0" w:oddHBand="0" w:evenHBand="0" w:firstRowFirstColumn="0" w:firstRowLastColumn="0" w:lastRowFirstColumn="0" w:lastRowLastColumn="0"/>
-            <w:tcW w:w="3175" w:type="dxa"/>
+            <w:tcW w:w="964" w:type="dxa"/>
           </w:tcPr>
           <w:p>
             <w:pPr>
               <w:keepNext/>
-              <w:spacing w:after="80" w:line="252" w:lineRule="auto"/>
+              <w:spacing w:after="40" w:line="252" w:lineRule="auto"/>
             </w:pPr>
             <w:r>
               <w:rPr>
                 <w:sz w:val="18"/>
               </w:rPr>
-              <w:t>ID / file</w:t>
+              <w:t>ID</w:t>
             </w:r>
           </w:p>
         </w:tc>
         <w:tc>
           <w:tcPr>
-            <w:tcW w:w="3175" w:type="dxa"/>
+            <w:tcW w:w="6803" w:type="dxa"/>
           </w:tcPr>
           <w:p>
             <w:pPr>
               <w:keepNext/>
-              <w:spacing w:after="80" w:line="252" w:lineRule="auto"/>
+              <w:spacing w:after="40" w:line="252" w:lineRule="auto"/>
               <w:cnfStyle w:val="100000000000" w:firstRow="1" w:lastRow="0" w:firstColumn="0" w:lastColumn="0" w:oddVBand="0" w:evenVBand="0" w:oddHBand="0" w:evenHBand="0" w:firstRowFirstColumn="0" w:firstRowLastColumn="0" w:lastRowFirstColumn="0" w:lastRowLastColumn="0"/>
             </w:pPr>
             <w:r>
               <w:rPr>
                 <w:sz w:val="18"/>
               </w:rPr>
-              <w:t>Executed scenario</w:t>
+              <w:t>Scenario</w:t>
             </w:r>
           </w:p>
         </w:tc>
         <w:tc>
           <w:tcPr>
-            <w:tcW w:w="3175" w:type="dxa"/>
+            <w:tcW w:w="1757" w:type="dxa"/>
           </w:tcPr>
           <w:p>
             <w:pPr>
               <w:keepNext/>
-              <w:spacing w:after="80" w:line="252" w:lineRule="auto"/>
+              <w:spacing w:after="40" w:line="252" w:lineRule="auto"/>
               <w:cnfStyle w:val="100000000000" w:firstRow="1" w:lastRow="0" w:firstColumn="0" w:lastColumn="0" w:oddVBand="0" w:evenVBand="0" w:oddHBand="0" w:evenHBand="0" w:firstRowFirstColumn="0" w:firstRowLastColumn="0" w:lastRowFirstColumn="0" w:lastRowLastColumn="0"/>
             </w:pPr>
             <w:r>
@@ -2452,64 +2527,51 @@
         <w:tc>
           <w:tcPr>
             <w:cnfStyle w:val="001000000000" w:firstRow="0" w:lastRow="0" w:firstColumn="1" w:lastColumn="0" w:oddVBand="0" w:evenVBand="0" w:oddHBand="0" w:evenHBand="0" w:firstRowFirstColumn="0" w:firstRowLastColumn="0" w:lastRowFirstColumn="0" w:lastRowLastColumn="0"/>
-            <w:tcW w:w="3175" w:type="dxa"/>
+            <w:tcW w:w="964" w:type="dxa"/>
           </w:tcPr>
           <w:p>
             <w:pPr>
-              <w:spacing w:after="80" w:line="252" w:lineRule="auto"/>
+              <w:spacing w:after="40" w:line="252" w:lineRule="auto"/>
             </w:pPr>
             <w:r>
               <w:rPr>
                 <w:sz w:val="18"/>
               </w:rPr>
               <w:t>E2E-01</w:t>
-            </w:r>
-            <w:r>
-              <w:rPr>
-                <w:sz w:val="18"/>
-              </w:rPr>
-              <w:br/>
-              <w:t>application.spec.ts</w:t>
             </w:r>
           </w:p>
         </w:tc>
         <w:tc>
           <w:tcPr>
-            <w:tcW w:w="3175" w:type="dxa"/>
+            <w:tcW w:w="6803" w:type="dxa"/>
           </w:tcPr>
           <w:p>
             <w:pPr>
-              <w:spacing w:after="80" w:line="252" w:lineRule="auto"/>
+              <w:spacing w:after="40" w:line="252" w:lineRule="auto"/>
               <w:cnfStyle w:val="000000100000" w:firstRow="0" w:lastRow="0" w:firstColumn="0" w:lastColumn="0" w:oddVBand="0" w:evenVBand="0" w:oddHBand="1" w:evenHBand="0" w:firstRowFirstColumn="0" w:firstRowLastColumn="0" w:lastRowFirstColumn="0" w:lastRowLastColumn="0"/>
             </w:pPr>
             <w:r>
               <w:rPr>
                 <w:sz w:val="18"/>
               </w:rPr>
-              <w:t xml:space="preserve">successful setup with failed auto-login does not ask to create account </w:t>
-            </w:r>
-            <w:r>
-              <w:rPr>
-                <w:sz w:val="18"/>
-              </w:rPr>
-              <w:t>again</w:t>
+              <w:t>Account setup remains complete if automatic sign-in fails. The user is not asked to create the account again.</w:t>
             </w:r>
           </w:p>
         </w:tc>
         <w:tc>
           <w:tcPr>
-            <w:tcW w:w="3175" w:type="dxa"/>
+            <w:tcW w:w="1757" w:type="dxa"/>
           </w:tcPr>
           <w:p>
             <w:pPr>
-              <w:spacing w:after="80" w:line="252" w:lineRule="auto"/>
+              <w:spacing w:after="40" w:line="252" w:lineRule="auto"/>
               <w:cnfStyle w:val="000000100000" w:firstRow="0" w:lastRow="0" w:firstColumn="0" w:lastColumn="0" w:oddVBand="0" w:evenVBand="0" w:oddHBand="1" w:evenHBand="0" w:firstRowFirstColumn="0" w:firstRowLastColumn="0" w:lastRowFirstColumn="0" w:lastRowLastColumn="0"/>
             </w:pPr>
             <w:r>
               <w:rPr>
                 <w:sz w:val="18"/>
               </w:rPr>
-              <w:t>PASSED</w:t>
+              <w:t>Passed</w:t>
             </w:r>
             <w:r>
               <w:rPr>
@@ -2528,58 +2590,57 @@
         <w:tc>
           <w:tcPr>
             <w:cnfStyle w:val="001000000000" w:firstRow="0" w:lastRow="0" w:firstColumn="1" w:lastColumn="0" w:oddVBand="0" w:evenVBand="0" w:oddHBand="0" w:evenHBand="0" w:firstRowFirstColumn="0" w:firstRowLastColumn="0" w:lastRowFirstColumn="0" w:lastRowLastColumn="0"/>
-            <w:tcW w:w="3175" w:type="dxa"/>
+            <w:tcW w:w="964" w:type="dxa"/>
           </w:tcPr>
           <w:p>
             <w:pPr>
-              <w:spacing w:after="80" w:line="252" w:lineRule="auto"/>
+              <w:spacing w:after="40" w:line="252" w:lineRule="auto"/>
             </w:pPr>
             <w:r>
               <w:rPr>
                 <w:sz w:val="18"/>
               </w:rPr>
               <w:t>E2E-02</w:t>
-            </w:r>
-            <w:r>
-              <w:rPr>
-                <w:sz w:val="18"/>
-              </w:rPr>
-              <w:br/>
-              <w:t>application.spec.ts</w:t>
             </w:r>
           </w:p>
         </w:tc>
         <w:tc>
           <w:tcPr>
-            <w:tcW w:w="3175" w:type="dxa"/>
+            <w:tcW w:w="6803" w:type="dxa"/>
           </w:tcPr>
           <w:p>
             <w:pPr>
-              <w:spacing w:after="80" w:line="252" w:lineRule="auto"/>
+              <w:spacing w:after="40" w:line="252" w:lineRule="auto"/>
               <w:cnfStyle w:val="000000000000" w:firstRow="0" w:lastRow="0" w:firstColumn="0" w:lastColumn="0" w:oddVBand="0" w:evenVBand="0" w:oddHBand="0" w:evenHBand="0" w:firstRowFirstColumn="0" w:firstRowLastColumn="0" w:lastRowFirstColumn="0" w:lastRowLastColumn="0"/>
             </w:pPr>
             <w:r>
               <w:rPr>
                 <w:sz w:val="18"/>
               </w:rPr>
-              <w:t>setup, private admin, anonymous widget, attachments and logout</w:t>
+              <w:t xml:space="preserve">Users can </w:t>
+            </w:r>
+            <w:r>
+              <w:rPr>
+                <w:sz w:val="18"/>
+              </w:rPr>
+              <w:t>complete setup, access the admin workspace, submit anonymous feedback with an image attachment, and sign out.</w:t>
             </w:r>
           </w:p>
         </w:tc>
         <w:tc>
           <w:tcPr>
-            <w:tcW w:w="3175" w:type="dxa"/>
+            <w:tcW w:w="1757" w:type="dxa"/>
           </w:tcPr>
           <w:p>
             <w:pPr>
-              <w:spacing w:after="80" w:line="252" w:lineRule="auto"/>
+              <w:spacing w:after="40" w:line="252" w:lineRule="auto"/>
               <w:cnfStyle w:val="000000000000" w:firstRow="0" w:lastRow="0" w:firstColumn="0" w:lastColumn="0" w:oddVBand="0" w:evenVBand="0" w:oddHBand="0" w:evenHBand="0" w:firstRowFirstColumn="0" w:firstRowLastColumn="0" w:lastRowFirstColumn="0" w:lastRowLastColumn="0"/>
             </w:pPr>
             <w:r>
               <w:rPr>
                 <w:sz w:val="18"/>
               </w:rPr>
-              <w:t>PASSED</w:t>
+              <w:t>Passed</w:t>
             </w:r>
             <w:r>
               <w:rPr>
@@ -2599,58 +2660,57 @@
         <w:tc>
           <w:tcPr>
             <w:cnfStyle w:val="001000000000" w:firstRow="0" w:lastRow="0" w:firstColumn="1" w:lastColumn="0" w:oddVBand="0" w:evenVBand="0" w:oddHBand="0" w:evenHBand="0" w:firstRowFirstColumn="0" w:firstRowLastColumn="0" w:lastRowFirstColumn="0" w:lastRowLastColumn="0"/>
-            <w:tcW w:w="3175" w:type="dxa"/>
+            <w:tcW w:w="964" w:type="dxa"/>
           </w:tcPr>
           <w:p>
             <w:pPr>
-              <w:spacing w:after="80" w:line="252" w:lineRule="auto"/>
+              <w:spacing w:after="40" w:line="252" w:lineRule="auto"/>
             </w:pPr>
             <w:r>
               <w:rPr>
                 <w:sz w:val="18"/>
               </w:rPr>
               <w:t>E2E-03</w:t>
-            </w:r>
-            <w:r>
-              <w:rPr>
-                <w:sz w:val="18"/>
-              </w:rPr>
-              <w:br/>
-              <w:t>application.spec.ts</w:t>
             </w:r>
           </w:p>
         </w:tc>
         <w:tc>
           <w:tcPr>
-            <w:tcW w:w="3175" w:type="dxa"/>
+            <w:tcW w:w="6803" w:type="dxa"/>
           </w:tcPr>
           <w:p>
             <w:pPr>
-              <w:spacing w:after="80" w:line="252" w:lineRule="auto"/>
+              <w:spacing w:after="40" w:line="252" w:lineRule="auto"/>
               <w:cnfStyle w:val="000000100000" w:firstRow="0" w:lastRow="0" w:firstColumn="0" w:lastColumn="0" w:oddVBand="0" w:evenVBand="0" w:oddHBand="1" w:evenHBand="0" w:firstRowFirstColumn="0" w:firstRowLastColumn="0" w:lastRowFirstColumn="0" w:lastRowLastColumn="0"/>
             </w:pPr>
             <w:r>
               <w:rPr>
                 <w:sz w:val="18"/>
               </w:rPr>
-              <w:t>anonymous retries, conflicting payloads, invalid files and request limits</w:t>
+              <w:t>Retrying an unchanged submission does not create a duplicate report. Reusing its ID with changed content, uploading an inval</w:t>
+            </w:r>
+            <w:r>
+              <w:rPr>
+                <w:sz w:val="18"/>
+              </w:rPr>
+              <w:t>id image, or exceeding request limits is rejected.</w:t>
             </w:r>
           </w:p>
         </w:tc>
         <w:tc>
           <w:tcPr>
-            <w:tcW w:w="3175" w:type="dxa"/>
+            <w:tcW w:w="1757" w:type="dxa"/>
           </w:tcPr>
           <w:p>
             <w:pPr>
-              <w:spacing w:after="80" w:line="252" w:lineRule="auto"/>
+              <w:spacing w:after="40" w:line="252" w:lineRule="auto"/>
               <w:cnfStyle w:val="000000100000" w:firstRow="0" w:lastRow="0" w:firstColumn="0" w:lastColumn="0" w:oddVBand="0" w:evenVBand="0" w:oddHBand="1" w:evenHBand="0" w:firstRowFirstColumn="0" w:firstRowLastColumn="0" w:lastRowFirstColumn="0" w:lastRowLastColumn="0"/>
             </w:pPr>
             <w:r>
               <w:rPr>
                 <w:sz w:val="18"/>
               </w:rPr>
-              <w:t>PASSED</w:t>
+              <w:t>Passed</w:t>
             </w:r>
             <w:r>
               <w:rPr>
@@ -2669,63 +2729,51 @@
         <w:tc>
           <w:tcPr>
             <w:cnfStyle w:val="001000000000" w:firstRow="0" w:lastRow="0" w:firstColumn="1" w:lastColumn="0" w:oddVBand="0" w:evenVBand="0" w:oddHBand="0" w:evenHBand="0" w:firstRowFirstColumn="0" w:firstRowLastColumn="0" w:lastRowFirstColumn="0" w:lastRowLastColumn="0"/>
-            <w:tcW w:w="3175" w:type="dxa"/>
+            <w:tcW w:w="964" w:type="dxa"/>
           </w:tcPr>
           <w:p>
             <w:pPr>
-              <w:spacing w:after="80" w:line="252" w:lineRule="auto"/>
+              <w:spacing w:after="40" w:line="252" w:lineRule="auto"/>
             </w:pPr>
             <w:r>
               <w:rPr>
                 <w:sz w:val="18"/>
               </w:rPr>
               <w:t>E2E-04</w:t>
-            </w:r>
-            <w:r>
-              <w:rPr>
-                <w:sz w:val="18"/>
-              </w:rPr>
-              <w:br/>
-            </w:r>
-            <w:r>
-              <w:rPr>
-                <w:sz w:val="18"/>
-              </w:rPr>
-              <w:t>landing.spec.ts</w:t>
             </w:r>
           </w:p>
         </w:tc>
         <w:tc>
           <w:tcPr>
-            <w:tcW w:w="3175" w:type="dxa"/>
+            <w:tcW w:w="6803" w:type="dxa"/>
           </w:tcPr>
           <w:p>
             <w:pPr>
-              <w:spacing w:after="80" w:line="252" w:lineRule="auto"/>
+              <w:spacing w:after="40" w:line="252" w:lineRule="auto"/>
               <w:cnfStyle w:val="000000000000" w:firstRow="0" w:lastRow="0" w:firstColumn="0" w:lastColumn="0" w:oddVBand="0" w:evenVBand="0" w:oddHBand="0" w:evenHBand="0" w:firstRowFirstColumn="0" w:firstRowLastColumn="0" w:lastRowFirstColumn="0" w:lastRowLastColumn="0"/>
             </w:pPr>
             <w:r>
               <w:rPr>
                 <w:sz w:val="18"/>
               </w:rPr>
-              <w:t>landing motion settles after rapid interaction and respects reduced motion</w:t>
+              <w:t>Landing page animations finish correctly after rapid interaction and follow reduced-motion settings.</w:t>
             </w:r>
           </w:p>
         </w:tc>
         <w:tc>
           <w:tcPr>
-            <w:tcW w:w="3175" w:type="dxa"/>
+            <w:tcW w:w="1757" w:type="dxa"/>
           </w:tcPr>
           <w:p>
             <w:pPr>
-              <w:spacing w:after="80" w:line="252" w:lineRule="auto"/>
+              <w:spacing w:after="40" w:line="252" w:lineRule="auto"/>
               <w:cnfStyle w:val="000000000000" w:firstRow="0" w:lastRow="0" w:firstColumn="0" w:lastColumn="0" w:oddVBand="0" w:evenVBand="0" w:oddHBand="0" w:evenHBand="0" w:firstRowFirstColumn="0" w:firstRowLastColumn="0" w:lastRowFirstColumn="0" w:lastRowLastColumn="0"/>
             </w:pPr>
             <w:r>
               <w:rPr>
                 <w:sz w:val="18"/>
               </w:rPr>
-              <w:t>PASSED</w:t>
+              <w:t>Passed</w:t>
             </w:r>
             <w:r>
               <w:rPr>
@@ -2745,58 +2793,57 @@
         <w:tc>
           <w:tcPr>
             <w:cnfStyle w:val="001000000000" w:firstRow="0" w:lastRow="0" w:firstColumn="1" w:lastColumn="0" w:oddVBand="0" w:evenVBand="0" w:oddHBand="0" w:evenHBand="0" w:firstRowFirstColumn="0" w:firstRowLastColumn="0" w:lastRowFirstColumn="0" w:lastRowLastColumn="0"/>
-            <w:tcW w:w="3175" w:type="dxa"/>
+            <w:tcW w:w="964" w:type="dxa"/>
           </w:tcPr>
           <w:p>
             <w:pPr>
-              <w:spacing w:after="80" w:line="252" w:lineRule="auto"/>
+              <w:spacing w:after="40" w:line="252" w:lineRule="auto"/>
             </w:pPr>
             <w:r>
               <w:rPr>
                 <w:sz w:val="18"/>
               </w:rPr>
               <w:t>E2E-05</w:t>
-            </w:r>
-            <w:r>
-              <w:rPr>
-                <w:sz w:val="18"/>
-              </w:rPr>
-              <w:br/>
-              <w:t>landing.spec.ts</w:t>
             </w:r>
           </w:p>
         </w:tc>
         <w:tc>
           <w:tcPr>
-            <w:tcW w:w="3175" w:type="dxa"/>
+            <w:tcW w:w="6803" w:type="dxa"/>
           </w:tcPr>
           <w:p>
             <w:pPr>
-              <w:spacing w:after="80" w:line="252" w:lineRule="auto"/>
+              <w:spacing w:after="40" w:line="252" w:lineRule="auto"/>
               <w:cnfStyle w:val="000000100000" w:firstRow="0" w:lastRow="0" w:firstColumn="0" w:lastColumn="0" w:oddVBand="0" w:evenVBand="0" w:oddHBand="1" w:evenHBand="0" w:firstRowFirstColumn="0" w:firstRowLastColumn="0" w:lastRowFirstColumn="0" w:lastRowLastColumn="0"/>
             </w:pPr>
             <w:r>
               <w:rPr>
                 <w:sz w:val="18"/>
               </w:rPr>
-              <w:t>completed entrances remain settled across resizing and preference changes</w:t>
+              <w:t>Completed opening animations stay in their final position when</w:t>
+            </w:r>
+            <w:r>
+              <w:rPr>
+                <w:sz w:val="18"/>
+              </w:rPr>
+              <w:t xml:space="preserve"> the window is resized or motion preferences change.</w:t>
             </w:r>
           </w:p>
         </w:tc>
         <w:tc>
           <w:tcPr>
-            <w:tcW w:w="3175" w:type="dxa"/>
+            <w:tcW w:w="1757" w:type="dxa"/>
           </w:tcPr>
           <w:p>
             <w:pPr>
-              <w:spacing w:after="80" w:line="252" w:lineRule="auto"/>
+              <w:spacing w:after="40" w:line="252" w:lineRule="auto"/>
               <w:cnfStyle w:val="000000100000" w:firstRow="0" w:lastRow="0" w:firstColumn="0" w:lastColumn="0" w:oddVBand="0" w:evenVBand="0" w:oddHBand="1" w:evenHBand="0" w:firstRowFirstColumn="0" w:firstRowLastColumn="0" w:lastRowFirstColumn="0" w:lastRowLastColumn="0"/>
             </w:pPr>
             <w:r>
               <w:rPr>
                 <w:sz w:val="18"/>
               </w:rPr>
-              <w:t>PASSED</w:t>
+              <w:t>Passed</w:t>
             </w:r>
             <w:r>
               <w:rPr>
@@ -2815,64 +2862,51 @@
         <w:tc>
           <w:tcPr>
             <w:cnfStyle w:val="001000000000" w:firstRow="0" w:lastRow="0" w:firstColumn="1" w:lastColumn="0" w:oddVBand="0" w:evenVBand="0" w:oddHBand="0" w:evenHBand="0" w:firstRowFirstColumn="0" w:firstRowLastColumn="0" w:lastRowFirstColumn="0" w:lastRowLastColumn="0"/>
-            <w:tcW w:w="3175" w:type="dxa"/>
+            <w:tcW w:w="964" w:type="dxa"/>
           </w:tcPr>
           <w:p>
             <w:pPr>
-              <w:spacing w:after="80" w:line="252" w:lineRule="auto"/>
+              <w:spacing w:after="40" w:line="252" w:lineRule="auto"/>
             </w:pPr>
             <w:r>
               <w:rPr>
                 <w:sz w:val="18"/>
               </w:rPr>
               <w:t>E2E-06</w:t>
-            </w:r>
-            <w:r>
-              <w:rPr>
-                <w:sz w:val="18"/>
-              </w:rPr>
-              <w:br/>
-              <w:t>landing.spec.ts</w:t>
             </w:r>
           </w:p>
         </w:tc>
         <w:tc>
           <w:tcPr>
-            <w:tcW w:w="3175" w:type="dxa"/>
+            <w:tcW w:w="6803" w:type="dxa"/>
           </w:tcPr>
           <w:p>
             <w:pPr>
-              <w:spacing w:after="80" w:line="252" w:lineRule="auto"/>
+              <w:spacing w:after="40" w:line="252" w:lineRule="auto"/>
               <w:cnfStyle w:val="000000000000" w:firstRow="0" w:lastRow="0" w:firstColumn="0" w:lastColumn="0" w:oddVBand="0" w:evenVBand="0" w:oddHBand="0" w:evenHBand="0" w:firstRowFirstColumn="0" w:firstRowLastColumn="0" w:lastRowFirstColumn="0" w:lastRowLastColumn="0"/>
             </w:pPr>
             <w:r>
               <w:rPr>
                 <w:sz w:val="18"/>
               </w:rPr>
-              <w:t>widget illustrati</w:t>
-            </w:r>
-            <w:r>
-              <w:rPr>
-                <w:sz w:val="18"/>
-              </w:rPr>
-              <w:t>on contents fit at intermediate widths</w:t>
+              <w:t>The example widget illustration on the landing page fits within its container at widths between mobile and desktop layouts.</w:t>
             </w:r>
           </w:p>
         </w:tc>
         <w:tc>
           <w:tcPr>
-            <w:tcW w:w="3175" w:type="dxa"/>
+            <w:tcW w:w="1757" w:type="dxa"/>
           </w:tcPr>
           <w:p>
             <w:pPr>
-              <w:spacing w:after="80" w:line="252" w:lineRule="auto"/>
+              <w:spacing w:after="40" w:line="252" w:lineRule="auto"/>
               <w:cnfStyle w:val="000000000000" w:firstRow="0" w:lastRow="0" w:firstColumn="0" w:lastColumn="0" w:oddVBand="0" w:evenVBand="0" w:oddHBand="0" w:evenHBand="0" w:firstRowFirstColumn="0" w:firstRowLastColumn="0" w:lastRowFirstColumn="0" w:lastRowLastColumn="0"/>
             </w:pPr>
             <w:r>
               <w:rPr>
                 <w:sz w:val="18"/>
               </w:rPr>
-              <w:t>PASSED</w:t>
+              <w:t>Passed</w:t>
             </w:r>
             <w:r>
               <w:rPr>
@@ -2892,58 +2926,57 @@
         <w:tc>
           <w:tcPr>
             <w:cnfStyle w:val="001000000000" w:firstRow="0" w:lastRow="0" w:firstColumn="1" w:lastColumn="0" w:oddVBand="0" w:evenVBand="0" w:oddHBand="0" w:evenHBand="0" w:firstRowFirstColumn="0" w:firstRowLastColumn="0" w:lastRowFirstColumn="0" w:lastRowLastColumn="0"/>
-            <w:tcW w:w="3175" w:type="dxa"/>
+            <w:tcW w:w="964" w:type="dxa"/>
           </w:tcPr>
           <w:p>
             <w:pPr>
-              <w:spacing w:after="80" w:line="252" w:lineRule="auto"/>
+              <w:spacing w:after="40" w:line="252" w:lineRule="auto"/>
             </w:pPr>
             <w:r>
               <w:rPr>
                 <w:sz w:val="18"/>
               </w:rPr>
               <w:t>E2E-07</w:t>
-            </w:r>
-            <w:r>
-              <w:rPr>
-                <w:sz w:val="18"/>
-              </w:rPr>
-              <w:br/>
-              <w:t>landing.spec.ts</w:t>
             </w:r>
           </w:p>
         </w:tc>
         <w:tc>
           <w:tcPr>
-            <w:tcW w:w="3175" w:type="dxa"/>
+            <w:tcW w:w="6803" w:type="dxa"/>
           </w:tcPr>
           <w:p>
             <w:pPr>
-              <w:spacing w:after="80" w:line="252" w:lineRule="auto"/>
+              <w:spacing w:after="40" w:line="252" w:lineRule="auto"/>
               <w:cnfStyle w:val="000000100000" w:firstRow="0" w:lastRow="0" w:firstColumn="0" w:lastColumn="0" w:oddVBand="0" w:evenVBand="0" w:oddHBand="1" w:evenHBand="0" w:firstRowFirstColumn="0" w:firstRowLastColumn="0" w:lastRowFirstColumn="0" w:lastRowLastColumn="0"/>
             </w:pPr>
             <w:r>
               <w:rPr>
                 <w:sz w:val="18"/>
               </w:rPr>
-              <w:t>public landing demo never writes feedback and works on mobile</w:t>
+              <w:t xml:space="preserve">The landing page demo works on </w:t>
+            </w:r>
+            <w:r>
+              <w:rPr>
+                <w:sz w:val="18"/>
+              </w:rPr>
+              <w:t>mobile and does not send or save real feedback.</w:t>
             </w:r>
           </w:p>
         </w:tc>
         <w:tc>
           <w:tcPr>
-            <w:tcW w:w="3175" w:type="dxa"/>
+            <w:tcW w:w="1757" w:type="dxa"/>
           </w:tcPr>
           <w:p>
             <w:pPr>
-              <w:spacing w:after="80" w:line="252" w:lineRule="auto"/>
+              <w:spacing w:after="40" w:line="252" w:lineRule="auto"/>
               <w:cnfStyle w:val="000000100000" w:firstRow="0" w:lastRow="0" w:firstColumn="0" w:lastColumn="0" w:oddVBand="0" w:evenVBand="0" w:oddHBand="1" w:evenHBand="0" w:firstRowFirstColumn="0" w:firstRowLastColumn="0" w:lastRowFirstColumn="0" w:lastRowLastColumn="0"/>
             </w:pPr>
             <w:r>
               <w:rPr>
                 <w:sz w:val="18"/>
               </w:rPr>
-              <w:t>PASSED</w:t>
+              <w:t>Passed</w:t>
             </w:r>
             <w:r>
               <w:rPr>
@@ -2962,58 +2995,51 @@
         <w:tc>
           <w:tcPr>
             <w:cnfStyle w:val="001000000000" w:firstRow="0" w:lastRow="0" w:firstColumn="1" w:lastColumn="0" w:oddVBand="0" w:evenVBand="0" w:oddHBand="0" w:evenHBand="0" w:firstRowFirstColumn="0" w:firstRowLastColumn="0" w:lastRowFirstColumn="0" w:lastRowLastColumn="0"/>
-            <w:tcW w:w="3175" w:type="dxa"/>
+            <w:tcW w:w="964" w:type="dxa"/>
           </w:tcPr>
           <w:p>
             <w:pPr>
-              <w:spacing w:after="80" w:line="252" w:lineRule="auto"/>
+              <w:spacing w:after="40" w:line="252" w:lineRule="auto"/>
             </w:pPr>
             <w:r>
               <w:rPr>
                 <w:sz w:val="18"/>
               </w:rPr>
               <w:t>E2E-08</w:t>
-            </w:r>
-            <w:r>
-              <w:rPr>
-                <w:sz w:val="18"/>
-              </w:rPr>
-              <w:br/>
-              <w:t>visual.spec.ts</w:t>
             </w:r>
           </w:p>
         </w:tc>
         <w:tc>
           <w:tcPr>
-            <w:tcW w:w="3175" w:type="dxa"/>
+            <w:tcW w:w="6803" w:type="dxa"/>
           </w:tcPr>
           <w:p>
             <w:pPr>
-              <w:spacing w:after="80" w:line="252" w:lineRule="auto"/>
+              <w:spacing w:after="40" w:line="252" w:lineRule="auto"/>
               <w:cnfStyle w:val="000000000000" w:firstRow="0" w:lastRow="0" w:firstColumn="0" w:lastColumn="0" w:oddVBand="0" w:evenVBand="0" w:oddHBand="0" w:evenHBand="0" w:firstRowFirstColumn="0" w:firstRowLastColumn="0" w:lastRowFirstColumn="0" w:lastRowLastColumn="0"/>
             </w:pPr>
             <w:r>
               <w:rPr>
                 <w:sz w:val="18"/>
               </w:rPr>
-              <w:t>website list and add form align side-by-side on desktop and stack on mobile</w:t>
+              <w:t>The website list and add-website form appear side by side on desktop and stack vertically on mobile.</w:t>
             </w:r>
           </w:p>
         </w:tc>
         <w:tc>
           <w:tcPr>
-            <w:tcW w:w="3175" w:type="dxa"/>
+            <w:tcW w:w="1757" w:type="dxa"/>
           </w:tcPr>
           <w:p>
             <w:pPr>
-              <w:spacing w:after="80" w:line="252" w:lineRule="auto"/>
+              <w:spacing w:after="40" w:line="252" w:lineRule="auto"/>
               <w:cnfStyle w:val="000000000000" w:firstRow="0" w:lastRow="0" w:firstColumn="0" w:lastColumn="0" w:oddVBand="0" w:evenVBand="0" w:oddHBand="0" w:evenHBand="0" w:firstRowFirstColumn="0" w:firstRowLastColumn="0" w:lastRowFirstColumn="0" w:lastRowLastColumn="0"/>
             </w:pPr>
             <w:r>
               <w:rPr>
                 <w:sz w:val="18"/>
               </w:rPr>
-              <w:t>PASSED</w:t>
+              <w:t>Passed</w:t>
             </w:r>
             <w:r>
               <w:rPr>
@@ -3033,58 +3059,57 @@
         <w:tc>
           <w:tcPr>
             <w:cnfStyle w:val="001000000000" w:firstRow="0" w:lastRow="0" w:firstColumn="1" w:lastColumn="0" w:oddVBand="0" w:evenVBand="0" w:oddHBand="0" w:evenHBand="0" w:firstRowFirstColumn="0" w:firstRowLastColumn="0" w:lastRowFirstColumn="0" w:lastRowLastColumn="0"/>
-            <w:tcW w:w="3175" w:type="dxa"/>
+            <w:tcW w:w="964" w:type="dxa"/>
           </w:tcPr>
           <w:p>
             <w:pPr>
-              <w:spacing w:after="80" w:line="252" w:lineRule="auto"/>
+              <w:spacing w:after="40" w:line="252" w:lineRule="auto"/>
             </w:pPr>
             <w:r>
               <w:rPr>
                 <w:sz w:val="18"/>
               </w:rPr>
               <w:t>E2E-09</w:t>
-            </w:r>
-            <w:r>
-              <w:rPr>
-                <w:sz w:val="18"/>
-              </w:rPr>
-              <w:br/>
-              <w:t>visual.spec.ts</w:t>
             </w:r>
           </w:p>
         </w:tc>
         <w:tc>
           <w:tcPr>
-            <w:tcW w:w="3175" w:type="dxa"/>
+            <w:tcW w:w="6803" w:type="dxa"/>
           </w:tcPr>
           <w:p>
             <w:pPr>
-              <w:spacing w:after="80" w:line="252" w:lineRule="auto"/>
+              <w:spacing w:after="40" w:line="252" w:lineRule="auto"/>
               <w:cnfStyle w:val="000000100000" w:firstRow="0" w:lastRow="0" w:firstColumn="0" w:lastColumn="0" w:oddVBand="0" w:evenVBand="0" w:oddHBand="1" w:evenHBand="0" w:firstRowFirstColumn="0" w:firstRowLastColumn="0" w:lastRowFirstColumn="0" w:lastRowLastColumn="0"/>
             </w:pPr>
             <w:r>
               <w:rPr>
                 <w:sz w:val="18"/>
               </w:rPr>
-              <w:t>desktop and mobile workspace render without overflow</w:t>
+              <w:t>The workspace fits desktop and mobile screens without content ove</w:t>
+            </w:r>
+            <w:r>
+              <w:rPr>
+                <w:sz w:val="18"/>
+              </w:rPr>
+              <w:t>rflowing the layout.</w:t>
             </w:r>
           </w:p>
         </w:tc>
         <w:tc>
           <w:tcPr>
-            <w:tcW w:w="3175" w:type="dxa"/>
+            <w:tcW w:w="1757" w:type="dxa"/>
           </w:tcPr>
           <w:p>
             <w:pPr>
-              <w:spacing w:after="80" w:line="252" w:lineRule="auto"/>
+              <w:spacing w:after="40" w:line="252" w:lineRule="auto"/>
               <w:cnfStyle w:val="000000100000" w:firstRow="0" w:lastRow="0" w:firstColumn="0" w:lastColumn="0" w:oddVBand="0" w:evenVBand="0" w:oddHBand="1" w:evenHBand="0" w:firstRowFirstColumn="0" w:firstRowLastColumn="0" w:lastRowFirstColumn="0" w:lastRowLastColumn="0"/>
             </w:pPr>
             <w:r>
               <w:rPr>
                 <w:sz w:val="18"/>
               </w:rPr>
-              <w:t>PASSED</w:t>
+              <w:t>Passed</w:t>
             </w:r>
             <w:r>
               <w:rPr>
@@ -3103,58 +3128,51 @@
         <w:tc>
           <w:tcPr>
             <w:cnfStyle w:val="001000000000" w:firstRow="0" w:lastRow="0" w:firstColumn="1" w:lastColumn="0" w:oddVBand="0" w:evenVBand="0" w:oddHBand="0" w:evenHBand="0" w:firstRowFirstColumn="0" w:firstRowLastColumn="0" w:lastRowFirstColumn="0" w:lastRowLastColumn="0"/>
-            <w:tcW w:w="3175" w:type="dxa"/>
+            <w:tcW w:w="964" w:type="dxa"/>
           </w:tcPr>
           <w:p>
             <w:pPr>
-              <w:spacing w:after="80" w:line="252" w:lineRule="auto"/>
+              <w:spacing w:after="40" w:line="252" w:lineRule="auto"/>
             </w:pPr>
             <w:r>
               <w:rPr>
                 <w:sz w:val="18"/>
               </w:rPr>
               <w:t>E2E-10</w:t>
-            </w:r>
-            <w:r>
-              <w:rPr>
-                <w:sz w:val="18"/>
-              </w:rPr>
-              <w:br/>
-              <w:t>visual.spec.ts</w:t>
             </w:r>
           </w:p>
         </w:tc>
         <w:tc>
           <w:tcPr>
-            <w:tcW w:w="3175" w:type="dxa"/>
+            <w:tcW w:w="6803" w:type="dxa"/>
           </w:tcPr>
           <w:p>
             <w:pPr>
-              <w:spacing w:after="80" w:line="252" w:lineRule="auto"/>
+              <w:spacing w:after="40" w:line="252" w:lineRule="auto"/>
               <w:cnfStyle w:val="000000000000" w:firstRow="0" w:lastRow="0" w:firstColumn="0" w:lastColumn="0" w:oddVBand="0" w:evenVBand="0" w:oddHBand="0" w:evenHBand="0" w:firstRowFirstColumn="0" w:firstRowLastColumn="0" w:lastRowFirstColumn="0" w:lastRowLastColumn="0"/>
             </w:pPr>
             <w:r>
               <w:rPr>
                 <w:sz w:val="18"/>
               </w:rPr>
-              <w:t>search, filters, settings persistence and public widget configuration</w:t>
+              <w:t>Search and category/status filters show matching reports or an empty state. The saved website name, button label, and button position remain after reload and appear in the visitor widget.</w:t>
             </w:r>
           </w:p>
         </w:tc>
         <w:tc>
           <w:tcPr>
-            <w:tcW w:w="3175" w:type="dxa"/>
+            <w:tcW w:w="1757" w:type="dxa"/>
           </w:tcPr>
           <w:p>
             <w:pPr>
-              <w:spacing w:after="80" w:line="252" w:lineRule="auto"/>
+              <w:spacing w:after="40" w:line="252" w:lineRule="auto"/>
               <w:cnfStyle w:val="000000000000" w:firstRow="0" w:lastRow="0" w:firstColumn="0" w:lastColumn="0" w:oddVBand="0" w:evenVBand="0" w:oddHBand="0" w:evenHBand="0" w:firstRowFirstColumn="0" w:firstRowLastColumn="0" w:lastRowFirstColumn="0" w:lastRowLastColumn="0"/>
             </w:pPr>
             <w:r>
               <w:rPr>
                 <w:sz w:val="18"/>
               </w:rPr>
-              <w:t>PASSED</w:t>
+              <w:t>Passed</w:t>
             </w:r>
             <w:r>
               <w:rPr>
@@ -3174,64 +3192,57 @@
         <w:tc>
           <w:tcPr>
             <w:cnfStyle w:val="001000000000" w:firstRow="0" w:lastRow="0" w:firstColumn="1" w:lastColumn="0" w:oddVBand="0" w:evenVBand="0" w:oddHBand="0" w:evenHBand="0" w:firstRowFirstColumn="0" w:firstRowLastColumn="0" w:lastRowFirstColumn="0" w:lastRowLastColumn="0"/>
-            <w:tcW w:w="3175" w:type="dxa"/>
+            <w:tcW w:w="964" w:type="dxa"/>
           </w:tcPr>
           <w:p>
             <w:pPr>
-              <w:spacing w:after="80" w:line="252" w:lineRule="auto"/>
+              <w:spacing w:after="40" w:line="252" w:lineRule="auto"/>
             </w:pPr>
             <w:r>
               <w:rPr>
                 <w:sz w:val="18"/>
               </w:rPr>
               <w:t>E2E-11</w:t>
-            </w:r>
-            <w:r>
-              <w:rPr>
-                <w:sz w:val="18"/>
-              </w:rPr>
-              <w:br/>
-              <w:t>visual.spec.ts</w:t>
             </w:r>
           </w:p>
         </w:tc>
         <w:tc>
           <w:tcPr>
-            <w:tcW w:w="3175" w:type="dxa"/>
+            <w:tcW w:w="6803" w:type="dxa"/>
           </w:tcPr>
           <w:p>
             <w:pPr>
-              <w:spacing w:after="80" w:line="252" w:lineRule="auto"/>
+              <w:spacing w:after="40" w:line="252" w:lineRule="auto"/>
               <w:cnfStyle w:val="000000100000" w:firstRow="0" w:lastRow="0" w:firstColumn="0" w:lastColumn="0" w:oddVBand="0" w:evenVBand="0" w:oddHBand="1" w:evenHBand="0" w:firstRowFirstColumn="0" w:firstRowLastColumn="0" w:lastRowFirstColumn="0" w:lastRowLastColumn="0"/>
             </w:pPr>
             <w:r>
               <w:rPr>
                 <w:sz w:val="18"/>
               </w:rPr>
-              <w:t>widget key rotation requ</w:t>
-            </w:r>
-            <w:r>
-              <w:rPr>
-                <w:sz w:val="18"/>
-              </w:rPr>
-              <w:t>ires confirmation and retires old key without deleting reports</w:t>
+              <w:t>Repl</w:t>
+            </w:r>
+            <w:r>
+              <w:rPr>
+                <w:sz w:val="18"/>
+              </w:rPr>
+              <w:t>acing a widget key requires confirmation. The previous key stops working, while existing reports are retained.</w:t>
             </w:r>
           </w:p>
         </w:tc>
         <w:tc>
           <w:tcPr>
-            <w:tcW w:w="3175" w:type="dxa"/>
+            <w:tcW w:w="1757" w:type="dxa"/>
           </w:tcPr>
           <w:p>
             <w:pPr>
-              <w:spacing w:after="80" w:line="252" w:lineRule="auto"/>
+              <w:spacing w:after="40" w:line="252" w:lineRule="auto"/>
               <w:cnfStyle w:val="000000100000" w:firstRow="0" w:lastRow="0" w:firstColumn="0" w:lastColumn="0" w:oddVBand="0" w:evenVBand="0" w:oddHBand="1" w:evenHBand="0" w:firstRowFirstColumn="0" w:firstRowLastColumn="0" w:lastRowFirstColumn="0" w:lastRowLastColumn="0"/>
             </w:pPr>
             <w:r>
               <w:rPr>
                 <w:sz w:val="18"/>
               </w:rPr>
-              <w:t>PASSED</w:t>
+              <w:t>Passed</w:t>
             </w:r>
             <w:r>
               <w:rPr>
@@ -3250,58 +3261,57 @@
         <w:tc>
           <w:tcPr>
             <w:cnfStyle w:val="001000000000" w:firstRow="0" w:lastRow="0" w:firstColumn="1" w:lastColumn="0" w:oddVBand="0" w:evenVBand="0" w:oddHBand="0" w:evenHBand="0" w:firstRowFirstColumn="0" w:firstRowLastColumn="0" w:lastRowFirstColumn="0" w:lastRowLastColumn="0"/>
-            <w:tcW w:w="3175" w:type="dxa"/>
+            <w:tcW w:w="964" w:type="dxa"/>
           </w:tcPr>
           <w:p>
             <w:pPr>
-              <w:spacing w:after="80" w:line="252" w:lineRule="auto"/>
+              <w:spacing w:after="40" w:line="252" w:lineRule="auto"/>
             </w:pPr>
             <w:r>
               <w:rPr>
                 <w:sz w:val="18"/>
               </w:rPr>
               <w:t>E2E-12</w:t>
-            </w:r>
-            <w:r>
-              <w:rPr>
-                <w:sz w:val="18"/>
-              </w:rPr>
-              <w:br/>
-              <w:t>zz-company-isolation.spec.ts</w:t>
             </w:r>
           </w:p>
         </w:tc>
         <w:tc>
           <w:tcPr>
-            <w:tcW w:w="3175" w:type="dxa"/>
+            <w:tcW w:w="6803" w:type="dxa"/>
           </w:tcPr>
           <w:p>
             <w:pPr>
-              <w:spacing w:after="80" w:line="252" w:lineRule="auto"/>
+              <w:spacing w:after="40" w:line="252" w:lineRule="auto"/>
               <w:cnfStyle w:val="000000000000" w:firstRow="0" w:lastRow="0" w:firstColumn="0" w:lastColumn="0" w:oddVBand="0" w:evenVBand="0" w:oddHBand="0" w:evenHBand="0" w:firstRowFirstColumn="0" w:firstRowLastColumn="0" w:lastRowFirstColumn="0" w:lastRowLastColumn="0"/>
             </w:pPr>
             <w:r>
               <w:rPr>
                 <w:sz w:val="18"/>
               </w:rPr>
-              <w:t>Company API and legacy routes reject foreign reports, notes, attachments and platform-only access</w:t>
+              <w:t>Company APIs and older endpoints block access to another Company's reports, notes, and attachments. Platform-level permissio</w:t>
+            </w:r>
+            <w:r>
+              <w:rPr>
+                <w:sz w:val="18"/>
+              </w:rPr>
+              <w:t>ns alone do not grant access.</w:t>
             </w:r>
           </w:p>
         </w:tc>
         <w:tc>
           <w:tcPr>
-            <w:tcW w:w="3175" w:type="dxa"/>
+            <w:tcW w:w="1757" w:type="dxa"/>
           </w:tcPr>
           <w:p>
             <w:pPr>
-              <w:spacing w:after="80" w:line="252" w:lineRule="auto"/>
+              <w:spacing w:after="40" w:line="252" w:lineRule="auto"/>
               <w:cnfStyle w:val="000000000000" w:firstRow="0" w:lastRow="0" w:firstColumn="0" w:lastColumn="0" w:oddVBand="0" w:evenVBand="0" w:oddHBand="0" w:evenHBand="0" w:firstRowFirstColumn="0" w:firstRowLastColumn="0" w:lastRowFirstColumn="0" w:lastRowLastColumn="0"/>
             </w:pPr>
             <w:r>
               <w:rPr>
                 <w:sz w:val="18"/>
               </w:rPr>
-              <w:t>PASSED</w:t>
+              <w:t>Passed</w:t>
             </w:r>
             <w:r>
               <w:rPr>
@@ -3321,64 +3331,51 @@
         <w:tc>
           <w:tcPr>
             <w:cnfStyle w:val="001000000000" w:firstRow="0" w:lastRow="0" w:firstColumn="1" w:lastColumn="0" w:oddVBand="0" w:evenVBand="0" w:oddHBand="0" w:evenHBand="0" w:firstRowFirstColumn="0" w:firstRowLastColumn="0" w:lastRowFirstColumn="0" w:lastRowLastColumn="0"/>
-            <w:tcW w:w="3175" w:type="dxa"/>
+            <w:tcW w:w="964" w:type="dxa"/>
           </w:tcPr>
           <w:p>
             <w:pPr>
-              <w:spacing w:after="80" w:line="252" w:lineRule="auto"/>
+              <w:spacing w:after="40" w:line="252" w:lineRule="auto"/>
             </w:pPr>
             <w:r>
               <w:rPr>
                 <w:sz w:val="18"/>
               </w:rPr>
               <w:t>E2E-13</w:t>
-            </w:r>
-            <w:r>
-              <w:rPr>
-                <w:sz w:val="18"/>
-              </w:rPr>
-              <w:br/>
-              <w:t>zz-feedback-reporting.sp</w:t>
-            </w:r>
-            <w:r>
-              <w:rPr>
-                <w:sz w:val="18"/>
-              </w:rPr>
-              <w:t>ec.ts</w:t>
             </w:r>
           </w:p>
         </w:tc>
         <w:tc>
           <w:tcPr>
-            <w:tcW w:w="3175" w:type="dxa"/>
+            <w:tcW w:w="6803" w:type="dxa"/>
           </w:tcPr>
           <w:p>
             <w:pPr>
-              <w:spacing w:after="80" w:line="252" w:lineRule="auto"/>
+              <w:spacing w:after="40" w:line="252" w:lineRule="auto"/>
               <w:cnfStyle w:val="000000100000" w:firstRow="0" w:lastRow="0" w:firstColumn="0" w:lastColumn="0" w:oddVBand="0" w:evenVBand="0" w:oddHBand="1" w:evenHBand="0" w:firstRowFirstColumn="0" w:firstRowLastColumn="0" w:lastRowFirstColumn="0" w:lastRowLastColumn="0"/>
             </w:pPr>
             <w:r>
               <w:rPr>
                 <w:sz w:val="18"/>
               </w:rPr>
-              <w:t>Company monthly line chart and three Excel periods match aggregate data</w:t>
+              <w:t>The Company's monthly chart loads. Annual, monthly, and all-time Excel exports match the report totals and row counts returned for each period.</w:t>
             </w:r>
           </w:p>
         </w:tc>
         <w:tc>
           <w:tcPr>
-            <w:tcW w:w="3175" w:type="dxa"/>
+            <w:tcW w:w="1757" w:type="dxa"/>
           </w:tcPr>
           <w:p>
             <w:pPr>
-              <w:spacing w:after="80" w:line="252" w:lineRule="auto"/>
+              <w:spacing w:after="40" w:line="252" w:lineRule="auto"/>
               <w:cnfStyle w:val="000000100000" w:firstRow="0" w:lastRow="0" w:firstColumn="0" w:lastColumn="0" w:oddVBand="0" w:evenVBand="0" w:oddHBand="1" w:evenHBand="0" w:firstRowFirstColumn="0" w:firstRowLastColumn="0" w:lastRowFirstColumn="0" w:lastRowLastColumn="0"/>
             </w:pPr>
             <w:r>
               <w:rPr>
                 <w:sz w:val="18"/>
               </w:rPr>
-              <w:t>PASSED</w:t>
+              <w:t>Passed</w:t>
             </w:r>
             <w:r>
               <w:rPr>
@@ -3397,58 +3394,57 @@
         <w:tc>
           <w:tcPr>
             <w:cnfStyle w:val="001000000000" w:firstRow="0" w:lastRow="0" w:firstColumn="1" w:lastColumn="0" w:oddVBand="0" w:evenVBand="0" w:oddHBand="0" w:evenHBand="0" w:firstRowFirstColumn="0" w:firstRowLastColumn="0" w:lastRowFirstColumn="0" w:lastRowLastColumn="0"/>
-            <w:tcW w:w="3175" w:type="dxa"/>
+            <w:tcW w:w="964" w:type="dxa"/>
           </w:tcPr>
           <w:p>
             <w:pPr>
-              <w:spacing w:after="80" w:line="252" w:lineRule="auto"/>
+              <w:spacing w:after="40" w:line="252" w:lineRule="auto"/>
             </w:pPr>
             <w:r>
               <w:rPr>
                 <w:sz w:val="18"/>
               </w:rPr>
               <w:t>E2E-14</w:t>
-            </w:r>
-            <w:r>
-              <w:rPr>
-                <w:sz w:val="18"/>
-              </w:rPr>
-              <w:br/>
-              <w:t>zz-filter-ui.spec.ts</w:t>
             </w:r>
           </w:p>
         </w:tc>
         <w:tc>
           <w:tcPr>
-            <w:tcW w:w="3175" w:type="dxa"/>
+            <w:tcW w:w="6803" w:type="dxa"/>
           </w:tcPr>
           <w:p>
             <w:pPr>
-              <w:spacing w:after="80" w:line="252" w:lineRule="auto"/>
+              <w:spacing w:after="40" w:line="252" w:lineRule="auto"/>
               <w:cnfStyle w:val="000000000000" w:firstRow="0" w:lastRow="0" w:firstColumn="0" w:lastColumn="0" w:oddVBand="0" w:evenVBand="0" w:oddHBand="0" w:evenHBand="0" w:firstRowFirstColumn="0" w:firstRowLastColumn="0" w:lastRowFirstColumn="0" w:lastRowLastColumn="0"/>
             </w:pPr>
             <w:r>
               <w:rPr>
                 <w:sz w:val="18"/>
               </w:rPr>
-              <w:t>filter popover floats without shifting table and preserves URL context</w:t>
+              <w:t xml:space="preserve">Opening the filter panel does not </w:t>
+            </w:r>
+            <w:r>
+              <w:rPr>
+                <w:sz w:val="18"/>
+              </w:rPr>
+              <w:t>move the table. Applying a filter keeps the selected page size in the URL.</w:t>
             </w:r>
           </w:p>
         </w:tc>
         <w:tc>
           <w:tcPr>
-            <w:tcW w:w="3175" w:type="dxa"/>
+            <w:tcW w:w="1757" w:type="dxa"/>
           </w:tcPr>
           <w:p>
             <w:pPr>
-              <w:spacing w:after="80" w:line="252" w:lineRule="auto"/>
+              <w:spacing w:after="40" w:line="252" w:lineRule="auto"/>
               <w:cnfStyle w:val="000000000000" w:firstRow="0" w:lastRow="0" w:firstColumn="0" w:lastColumn="0" w:oddVBand="0" w:evenVBand="0" w:oddHBand="0" w:evenHBand="0" w:firstRowFirstColumn="0" w:firstRowLastColumn="0" w:lastRowFirstColumn="0" w:lastRowLastColumn="0"/>
             </w:pPr>
             <w:r>
               <w:rPr>
                 <w:sz w:val="18"/>
               </w:rPr>
-              <w:t>PASSED</w:t>
+              <w:t>Passed</w:t>
             </w:r>
             <w:r>
               <w:rPr>
@@ -3468,64 +3464,57 @@
         <w:tc>
           <w:tcPr>
             <w:cnfStyle w:val="001000000000" w:firstRow="0" w:lastRow="0" w:firstColumn="1" w:lastColumn="0" w:oddVBand="0" w:evenVBand="0" w:oddHBand="0" w:evenHBand="0" w:firstRowFirstColumn="0" w:firstRowLastColumn="0" w:lastRowFirstColumn="0" w:lastRowLastColumn="0"/>
-            <w:tcW w:w="3175" w:type="dxa"/>
+            <w:tcW w:w="964" w:type="dxa"/>
           </w:tcPr>
           <w:p>
             <w:pPr>
-              <w:spacing w:after="80" w:line="252" w:lineRule="auto"/>
+              <w:spacing w:after="40" w:line="252" w:lineRule="auto"/>
             </w:pPr>
             <w:r>
               <w:rPr>
                 <w:sz w:val="18"/>
               </w:rPr>
               <w:t>E2E-15</w:t>
-            </w:r>
-            <w:r>
-              <w:rPr>
-                <w:sz w:val="18"/>
-              </w:rPr>
-              <w:br/>
-              <w:t>zz-platform.spec.ts</w:t>
             </w:r>
           </w:p>
         </w:tc>
         <w:tc>
           <w:tcPr>
-            <w:tcW w:w="3175" w:type="dxa"/>
+            <w:tcW w:w="6803" w:type="dxa"/>
           </w:tcPr>
           <w:p>
             <w:pPr>
-              <w:spacing w:after="80" w:line="252" w:lineRule="auto"/>
+              <w:spacing w:after="40" w:line="252" w:lineRule="auto"/>
               <w:cnfStyle w:val="000000100000" w:firstRow="0" w:lastRow="0" w:firstColumn="0" w:lastColumn="0" w:oddVBand="0" w:evenVBand="0" w:oddHBand="1" w:evenHBand="0" w:firstRowFirstColumn="0" w:firstRowLastColumn="0" w:lastRowFirstColumn="0" w:lastRowLastColumn="0"/>
             </w:pPr>
             <w:r>
               <w:rPr>
                 <w:sz w:val="18"/>
               </w:rPr>
-              <w:t xml:space="preserve">platform owner has </w:t>
-            </w:r>
-            <w:r>
-              <w:rPr>
-                <w:sz w:val="18"/>
-              </w:rPr>
-              <w:t>separate console, real metadata and audited Company management</w:t>
+              <w:t>The Platform Owner has a separate console with activity charts, Company records, and account controls. Company suspension, reactivation, and website-limit chang</w:t>
+            </w:r>
+            <w:r>
+              <w:rPr>
+                <w:sz w:val="18"/>
+              </w:rPr>
+              <w:t>es work, and the saved limit change appears in the audit log.</w:t>
             </w:r>
           </w:p>
         </w:tc>
         <w:tc>
           <w:tcPr>
-            <w:tcW w:w="3175" w:type="dxa"/>
+            <w:tcW w:w="1757" w:type="dxa"/>
           </w:tcPr>
           <w:p>
             <w:pPr>
-              <w:spacing w:after="80" w:line="252" w:lineRule="auto"/>
+              <w:spacing w:after="40" w:line="252" w:lineRule="auto"/>
               <w:cnfStyle w:val="000000100000" w:firstRow="0" w:lastRow="0" w:firstColumn="0" w:lastColumn="0" w:oddVBand="0" w:evenVBand="0" w:oddHBand="1" w:evenHBand="0" w:firstRowFirstColumn="0" w:firstRowLastColumn="0" w:lastRowFirstColumn="0" w:lastRowLastColumn="0"/>
             </w:pPr>
             <w:r>
               <w:rPr>
                 <w:sz w:val="18"/>
               </w:rPr>
-              <w:t>PASSED</w:t>
+              <w:t>Passed</w:t>
             </w:r>
             <w:r>
               <w:rPr>
@@ -3544,58 +3533,51 @@
         <w:tc>
           <w:tcPr>
             <w:cnfStyle w:val="001000000000" w:firstRow="0" w:lastRow="0" w:firstColumn="1" w:lastColumn="0" w:oddVBand="0" w:evenVBand="0" w:oddHBand="0" w:evenHBand="0" w:firstRowFirstColumn="0" w:firstRowLastColumn="0" w:lastRowFirstColumn="0" w:lastRowLastColumn="0"/>
-            <w:tcW w:w="3175" w:type="dxa"/>
+            <w:tcW w:w="964" w:type="dxa"/>
           </w:tcPr>
           <w:p>
             <w:pPr>
-              <w:spacing w:after="80" w:line="252" w:lineRule="auto"/>
+              <w:spacing w:after="40" w:line="252" w:lineRule="auto"/>
             </w:pPr>
             <w:r>
               <w:rPr>
                 <w:sz w:val="18"/>
               </w:rPr>
               <w:t>E2E-16</w:t>
-            </w:r>
-            <w:r>
-              <w:rPr>
-                <w:sz w:val="18"/>
-              </w:rPr>
-              <w:br/>
-              <w:t>zz-session-navigation.spec.ts</w:t>
             </w:r>
           </w:p>
         </w:tc>
         <w:tc>
           <w:tcPr>
-            <w:tcW w:w="3175" w:type="dxa"/>
+            <w:tcW w:w="6803" w:type="dxa"/>
           </w:tcPr>
           <w:p>
             <w:pPr>
-              <w:spacing w:after="80" w:line="252" w:lineRule="auto"/>
+              <w:spacing w:after="40" w:line="252" w:lineRule="auto"/>
               <w:cnfStyle w:val="000000000000" w:firstRow="0" w:lastRow="0" w:firstColumn="0" w:lastColumn="0" w:oddVBand="0" w:evenVBand="0" w:oddHBand="0" w:evenHBand="0" w:firstRowFirstColumn="0" w:firstRowLastColumn="0" w:lastRowFirstColumn="0" w:lastRowLastColumn="0"/>
             </w:pPr>
             <w:r>
               <w:rPr>
                 <w:sz w:val="18"/>
               </w:rPr>
-              <w:t>landing and login recognize current owner session and revoked cookies</w:t>
+              <w:t>The landing and login pages recognize an active Platform Owner session. Reusing its cookies after sign-out does not restore access.</w:t>
             </w:r>
           </w:p>
         </w:tc>
         <w:tc>
           <w:tcPr>
-            <w:tcW w:w="3175" w:type="dxa"/>
+            <w:tcW w:w="1757" w:type="dxa"/>
           </w:tcPr>
           <w:p>
             <w:pPr>
-              <w:spacing w:after="80" w:line="252" w:lineRule="auto"/>
+              <w:spacing w:after="40" w:line="252" w:lineRule="auto"/>
               <w:cnfStyle w:val="000000000000" w:firstRow="0" w:lastRow="0" w:firstColumn="0" w:lastColumn="0" w:oddVBand="0" w:evenVBand="0" w:oddHBand="0" w:evenHBand="0" w:firstRowFirstColumn="0" w:firstRowLastColumn="0" w:lastRowFirstColumn="0" w:lastRowLastColumn="0"/>
             </w:pPr>
             <w:r>
               <w:rPr>
                 <w:sz w:val="18"/>
               </w:rPr>
-              <w:t>PASSED</w:t>
+              <w:t>Passed</w:t>
             </w:r>
             <w:r>
               <w:rPr>
@@ -3615,65 +3597,57 @@
         <w:tc>
           <w:tcPr>
             <w:cnfStyle w:val="001000000000" w:firstRow="0" w:lastRow="0" w:firstColumn="1" w:lastColumn="0" w:oddVBand="0" w:evenVBand="0" w:oddHBand="0" w:evenHBand="0" w:firstRowFirstColumn="0" w:firstRowLastColumn="0" w:lastRowFirstColumn="0" w:lastRowLastColumn="0"/>
-            <w:tcW w:w="3175" w:type="dxa"/>
+            <w:tcW w:w="964" w:type="dxa"/>
           </w:tcPr>
           <w:p>
             <w:pPr>
-              <w:spacing w:after="80" w:line="252" w:lineRule="auto"/>
+              <w:spacing w:after="40" w:line="252" w:lineRule="auto"/>
             </w:pPr>
             <w:r>
               <w:rPr>
                 <w:sz w:val="18"/>
               </w:rPr>
-              <w:lastRenderedPageBreak/>
               <w:t>E2E-17</w:t>
-            </w:r>
-            <w:r>
-              <w:rPr>
-                <w:sz w:val="18"/>
-              </w:rPr>
-              <w:br/>
-              <w:t>zz-skeleton.spec.ts</w:t>
             </w:r>
           </w:p>
         </w:tc>
         <w:tc>
           <w:tcPr>
-            <w:tcW w:w="3175" w:type="dxa"/>
+            <w:tcW w:w="6803" w:type="dxa"/>
           </w:tcPr>
           <w:p>
             <w:pPr>
-              <w:spacing w:after="80" w:line="252" w:lineRule="auto"/>
+              <w:spacing w:after="40" w:line="252" w:lineRule="auto"/>
               <w:cnfStyle w:val="000000100000" w:firstRow="0" w:lastRow="0" w:firstColumn="0" w:lastColumn="0" w:oddVBand="0" w:evenVBand="0" w:oddHBand="1" w:evenHBand="0" w:firstRowFirstColumn="0" w:firstRowLastColumn="0" w:lastRowFirstColumn="0" w:lastRowLastColumn="0"/>
             </w:pPr>
             <w:r>
               <w:rPr>
                 <w:sz w:val="18"/>
               </w:rPr>
-              <w:t xml:space="preserve">data skeletons remain </w:t>
-            </w:r>
-            <w:r>
-              <w:rPr>
-                <w:sz w:val="18"/>
-              </w:rPr>
-              <w:t>until response, disappear on success/error and respect reduced motion</w:t>
+              <w:t xml:space="preserve">Loading </w:t>
+            </w:r>
+            <w:r>
+              <w:rPr>
+                <w:sz w:val="18"/>
+              </w:rPr>
+              <w:t>placeholders remain visible while requests are pending, disappear after success or an error, and follow reduced-motion settings.</w:t>
             </w:r>
           </w:p>
         </w:tc>
         <w:tc>
           <w:tcPr>
-            <w:tcW w:w="3175" w:type="dxa"/>
+            <w:tcW w:w="1757" w:type="dxa"/>
           </w:tcPr>
           <w:p>
             <w:pPr>
-              <w:spacing w:after="80" w:line="252" w:lineRule="auto"/>
+              <w:spacing w:after="40" w:line="252" w:lineRule="auto"/>
               <w:cnfStyle w:val="000000100000" w:firstRow="0" w:lastRow="0" w:firstColumn="0" w:lastColumn="0" w:oddVBand="0" w:evenVBand="0" w:oddHBand="1" w:evenHBand="0" w:firstRowFirstColumn="0" w:firstRowLastColumn="0" w:lastRowFirstColumn="0" w:lastRowLastColumn="0"/>
             </w:pPr>
             <w:r>
               <w:rPr>
                 <w:sz w:val="18"/>
               </w:rPr>
-              <w:t>PASSED</w:t>
+              <w:t>Passed</w:t>
             </w:r>
             <w:r>
               <w:rPr>
@@ -3692,58 +3666,51 @@
         <w:tc>
           <w:tcPr>
             <w:cnfStyle w:val="001000000000" w:firstRow="0" w:lastRow="0" w:firstColumn="1" w:lastColumn="0" w:oddVBand="0" w:evenVBand="0" w:oddHBand="0" w:evenHBand="0" w:firstRowFirstColumn="0" w:firstRowLastColumn="0" w:lastRowFirstColumn="0" w:lastRowLastColumn="0"/>
-            <w:tcW w:w="3175" w:type="dxa"/>
+            <w:tcW w:w="964" w:type="dxa"/>
           </w:tcPr>
           <w:p>
             <w:pPr>
-              <w:spacing w:after="80" w:line="252" w:lineRule="auto"/>
+              <w:spacing w:after="40" w:line="252" w:lineRule="auto"/>
             </w:pPr>
             <w:r>
               <w:rPr>
                 <w:sz w:val="18"/>
               </w:rPr>
               <w:t>E2E-18</w:t>
-            </w:r>
-            <w:r>
-              <w:rPr>
-                <w:sz w:val="18"/>
-              </w:rPr>
-              <w:br/>
-              <w:t>zz-tracking.spec.ts</w:t>
             </w:r>
           </w:p>
         </w:tc>
         <w:tc>
           <w:tcPr>
-            <w:tcW w:w="3175" w:type="dxa"/>
+            <w:tcW w:w="6803" w:type="dxa"/>
           </w:tcPr>
           <w:p>
             <w:pPr>
-              <w:spacing w:after="80" w:line="252" w:lineRule="auto"/>
+              <w:spacing w:after="40" w:line="252" w:lineRule="auto"/>
               <w:cnfStyle w:val="000000000000" w:firstRow="0" w:lastRow="0" w:firstColumn="0" w:lastColumn="0" w:oddVBand="0" w:evenVBand="0" w:oddHBand="0" w:evenHBand="0" w:firstRowFirstColumn="0" w:firstRowLastColumn="0" w:lastRowFirstColumn="0" w:lastRowLastColumn="0"/>
             </w:pPr>
             <w:r>
               <w:rPr>
                 <w:sz w:val="18"/>
               </w:rPr>
-              <w:t>visitor tracks an anonymous report and sees public replies but never internal notes</w:t>
+              <w:t>Visitors can track an anonymous report and read public team replies. Internal notes remain hidden.</w:t>
             </w:r>
           </w:p>
         </w:tc>
         <w:tc>
           <w:tcPr>
-            <w:tcW w:w="3175" w:type="dxa"/>
+            <w:tcW w:w="1757" w:type="dxa"/>
           </w:tcPr>
           <w:p>
             <w:pPr>
-              <w:spacing w:after="80" w:line="252" w:lineRule="auto"/>
+              <w:spacing w:after="40" w:line="252" w:lineRule="auto"/>
               <w:cnfStyle w:val="000000000000" w:firstRow="0" w:lastRow="0" w:firstColumn="0" w:lastColumn="0" w:oddVBand="0" w:evenVBand="0" w:oddHBand="0" w:evenHBand="0" w:firstRowFirstColumn="0" w:firstRowLastColumn="0" w:lastRowFirstColumn="0" w:lastRowLastColumn="0"/>
             </w:pPr>
             <w:r>
               <w:rPr>
                 <w:sz w:val="18"/>
               </w:rPr>
-              <w:t>PASSED</w:t>
+              <w:t>Passed</w:t>
             </w:r>
             <w:r>
               <w:rPr>
@@ -3763,64 +3730,51 @@
         <w:tc>
           <w:tcPr>
             <w:cnfStyle w:val="001000000000" w:firstRow="0" w:lastRow="0" w:firstColumn="1" w:lastColumn="0" w:oddVBand="0" w:evenVBand="0" w:oddHBand="0" w:evenHBand="0" w:firstRowFirstColumn="0" w:firstRowLastColumn="0" w:lastRowFirstColumn="0" w:lastRowLastColumn="0"/>
-            <w:tcW w:w="3175" w:type="dxa"/>
+            <w:tcW w:w="964" w:type="dxa"/>
           </w:tcPr>
           <w:p>
             <w:pPr>
-              <w:spacing w:after="80" w:line="252" w:lineRule="auto"/>
+              <w:spacing w:after="40" w:line="252" w:lineRule="auto"/>
             </w:pPr>
             <w:r>
               <w:rPr>
                 <w:sz w:val="18"/>
               </w:rPr>
               <w:t>E2E-19</w:t>
-            </w:r>
-            <w:r>
-              <w:rPr>
-                <w:sz w:val="18"/>
-              </w:rPr>
-              <w:br/>
-              <w:t>zzz-onboarding.spec.ts</w:t>
             </w:r>
           </w:p>
         </w:tc>
         <w:tc>
           <w:tcPr>
-            <w:tcW w:w="3175" w:type="dxa"/>
+            <w:tcW w:w="6803" w:type="dxa"/>
           </w:tcPr>
           <w:p>
             <w:pPr>
-              <w:spacing w:after="80" w:line="252" w:lineRule="auto"/>
+              <w:spacing w:after="40" w:line="252" w:lineRule="auto"/>
               <w:cnfStyle w:val="000000100000" w:firstRow="0" w:lastRow="0" w:firstColumn="0" w:lastColumn="0" w:oddVBand="0" w:evenVBand="0" w:oddHBand="1" w:evenHBand="0" w:firstRowFirstColumn="0" w:firstRowLastColumn="0" w:lastRowFirstColumn="0" w:lastRowLastColumn="0"/>
             </w:pPr>
             <w:r>
               <w:rPr>
                 <w:sz w:val="18"/>
               </w:rPr>
-              <w:t>local client veri</w:t>
-            </w:r>
-            <w:r>
-              <w:rPr>
-                <w:sz w:val="18"/>
-              </w:rPr>
-              <w:t>fies email, creates Company, connects website and resets password</w:t>
+              <w:t>A new user can verify their email through the local test mailbox, create a Company, add a website, and reset their password.</w:t>
             </w:r>
           </w:p>
         </w:tc>
         <w:tc>
           <w:tcPr>
-            <w:tcW w:w="3175" w:type="dxa"/>
+            <w:tcW w:w="1757" w:type="dxa"/>
           </w:tcPr>
           <w:p>
             <w:pPr>
-              <w:spacing w:after="80" w:line="252" w:lineRule="auto"/>
+              <w:spacing w:after="40" w:line="252" w:lineRule="auto"/>
               <w:cnfStyle w:val="000000100000" w:firstRow="0" w:lastRow="0" w:firstColumn="0" w:lastColumn="0" w:oddVBand="0" w:evenVBand="0" w:oddHBand="1" w:evenHBand="0" w:firstRowFirstColumn="0" w:firstRowLastColumn="0" w:lastRowFirstColumn="0" w:lastRowLastColumn="0"/>
             </w:pPr>
             <w:r>
               <w:rPr>
                 <w:sz w:val="18"/>
               </w:rPr>
-              <w:t>PASSED</w:t>
+              <w:t>Passed</w:t>
             </w:r>
             <w:r>
               <w:rPr>
@@ -3843,7 +3797,7 @@
         <w:pStyle w:val="Heading1"/>
         <w:pageBreakBefore/>
       </w:pPr>
-      <w:bookmarkStart w:id="9" w:name="_Toc242791547"/>
+      <w:bookmarkStart w:id="9" w:name="_Toc242876791"/>
       <w:r>
         <w:lastRenderedPageBreak/>
         <w:t>9. Screenshot: landing page</w:t>
@@ -3852,7 +3806,10 @@
     </w:p>
     <w:p>
       <w:r>
-        <w:t>Captured during the recorded browser run. The reports shown in the landing preview are examples, not customer submissions.</w:t>
+        <w:t>Captured during the recorded browser run. The reports shown in the</w:t>
+      </w:r>
+      <w:r>
+        <w:t xml:space="preserve"> landing preview are examples, not customer submissions.</w:t>
       </w:r>
     </w:p>
     <w:p>
@@ -3865,7 +3822,7 @@
           <w:noProof/>
         </w:rPr>
         <w:drawing>
-          <wp:inline distT="0" distB="0" distL="0" distR="0" wp14:anchorId="583A9767" wp14:editId="5ACF303F">
+          <wp:inline distT="0" distB="0" distL="0" distR="0" wp14:anchorId="701D2DDD" wp14:editId="2A755865">
             <wp:extent cx="3055906" cy="6217920"/>
             <wp:effectExtent l="0" t="0" r="0" b="0"/>
             <wp:docPr id="2" name="Picture 2" descr="Test environment screenshot: landing page"/>
@@ -3906,10 +3863,7 @@
         <w:pStyle w:val="Caption"/>
       </w:pPr>
       <w:r>
-        <w:t xml:space="preserve">Figure 2. Test </w:t>
-      </w:r>
-      <w:r>
-        <w:t>environment screenshot: landing page</w:t>
+        <w:t>Figure 2. Test environment screenshot: landing page</w:t>
       </w:r>
     </w:p>
     <w:p>
@@ -3917,7 +3871,7 @@
         <w:pStyle w:val="Heading1"/>
         <w:pageBreakBefore/>
       </w:pPr>
-      <w:bookmarkStart w:id="10" w:name="_Toc242791548"/>
+      <w:bookmarkStart w:id="10" w:name="_Toc242876792"/>
       <w:r>
         <w:lastRenderedPageBreak/>
         <w:t>10. Screenshot: team inbox</w:t>
@@ -3926,7 +3880,10 @@
     </w:p>
     <w:p>
       <w:r>
-        <w:t>The inbox contains test reports in a separate test environment. It shows the screen used to review feedback and does not represent real customer activity.</w:t>
+        <w:t>The inbox contains test reports in a separate test environment. It shows the screen used to review feedback and does n</w:t>
+      </w:r>
+      <w:r>
+        <w:t>ot represent real customer activity.</w:t>
       </w:r>
     </w:p>
     <w:p>
@@ -3939,7 +3896,7 @@
           <w:noProof/>
         </w:rPr>
         <w:drawing>
-          <wp:inline distT="0" distB="0" distL="0" distR="0" wp14:anchorId="597AB4F4" wp14:editId="537CED33">
+          <wp:inline distT="0" distB="0" distL="0" distR="0" wp14:anchorId="72CCDDC0" wp14:editId="3863FE65">
             <wp:extent cx="5989320" cy="6139053"/>
             <wp:effectExtent l="0" t="0" r="0" b="0"/>
             <wp:docPr id="3" name="Picture 3" descr="Test environment screenshot: team inbox"/>
@@ -3980,10 +3937,7 @@
         <w:pStyle w:val="Caption"/>
       </w:pPr>
       <w:r>
-        <w:t>Figure 3. Test environment screensh</w:t>
-      </w:r>
-      <w:r>
-        <w:t>ot: team inbox</w:t>
+        <w:t>Figure 3. Test environment screenshot: team inbox</w:t>
       </w:r>
     </w:p>
     <w:p>
@@ -3991,7 +3945,7 @@
         <w:pStyle w:val="Heading1"/>
         <w:pageBreakBefore/>
       </w:pPr>
-      <w:bookmarkStart w:id="11" w:name="_Toc242791549"/>
+      <w:bookmarkStart w:id="11" w:name="_Toc242876793"/>
       <w:r>
         <w:lastRenderedPageBreak/>
         <w:t>11. Screenshot: visitor widget</w:t>
@@ -4000,7 +3954,10 @@
     </w:p>
     <w:p>
       <w:r>
-        <w:t>The registered test website displays the feedback form at a phone-sized screen width. The selected screenshot does not display a live private tracking code or a password.</w:t>
+        <w:t>The registered test website displays the feedback form at a phone-sized screen width. The selected screenshot does not display a live pr</w:t>
+      </w:r>
+      <w:r>
+        <w:t>ivate tracking code or a password.</w:t>
       </w:r>
     </w:p>
     <w:p>
@@ -4013,7 +3970,7 @@
           <w:noProof/>
         </w:rPr>
         <w:drawing>
-          <wp:inline distT="0" distB="0" distL="0" distR="0" wp14:anchorId="7AA4A154" wp14:editId="18CE119F">
+          <wp:inline distT="0" distB="0" distL="0" distR="0" wp14:anchorId="6F23350A" wp14:editId="34B6C45C">
             <wp:extent cx="2873209" cy="6217919"/>
             <wp:effectExtent l="0" t="0" r="0" b="0"/>
             <wp:docPr id="4" name="Picture 4" descr="Test environment screenshot: visitor widget"/>
@@ -4054,17 +4011,14 @@
         <w:pStyle w:val="Caption"/>
       </w:pPr>
       <w:r>
-        <w:t>Figure 4. Test environment screenshot</w:t>
-      </w:r>
-      <w:r>
-        <w:t>: visitor widget</w:t>
+        <w:t>Figure 4. Test environment screenshot: visitor widget</w:t>
       </w:r>
     </w:p>
     <w:p>
       <w:pPr>
         <w:pStyle w:val="Heading1"/>
       </w:pPr>
-      <w:bookmarkStart w:id="12" w:name="_Toc242791550"/>
+      <w:bookmarkStart w:id="12" w:name="_Toc242876794"/>
       <w:r>
         <w:t>12. What the results establish</w:t>
       </w:r>
@@ -4072,34 +4026,34 @@
     </w:p>
     <w:p>
       <w:r>
-        <w:t>All recorded scenarios passed on the stated version and environment. This verifies those workflows, not every possible use of the app. It does not measure heavy-load performance, prove that all vulnerabilitie</w:t>
+        <w:t xml:space="preserve">All recorded scenarios passed on the stated version and environment. This verifies those workflows, not every possible use of the </w:t>
       </w:r>
       <w:r>
-        <w:t>s are absent, or establish production availability.</w:t>
+        <w:t>app. It does not measure heavy-load performance, prove that all vulnerabilities are absent, or establish production availability.</w:t>
       </w:r>
     </w:p>
     <w:p>
       <w:r>
         <w:lastRenderedPageBreak/>
-        <w:t>Earlier test logs contained warnings about concurrent pg queries and Vite configuration compatibility. A warning is different from a failed assertion and should still be reviewed. Some tests need the reco</w:t>
+        <w:t xml:space="preserve">Earlier test logs contained warnings about concurrent pg queries and Vite configuration compatibility. A warning is different </w:t>
       </w:r>
       <w:r>
-        <w:t>rds produced by earlier tests, so running a single file may require additional setup.</w:t>
+        <w:t>from a failed assertion and should still be reviewed. Some tests need the records produced by earlier tests, so running a single file may require additional setup.</w:t>
       </w:r>
     </w:p>
     <w:p>
       <w:r>
-        <w:t xml:space="preserve">Separate recorded checks passed 269 unit/component tests and 90 integration tests on 13 October 2026. Those counts are supporting evidence and are not included in the 19 </w:t>
+        <w:t>Separate recorded checks passed 269 unit/component tests and 90 integration tests on 13 Octo</w:t>
       </w:r>
       <w:r>
-        <w:t>browser scenarios.</w:t>
+        <w:t>ber 2026. Those counts are supporting evidence and are not included in the 19 browser scenarios.</w:t>
       </w:r>
     </w:p>
     <w:p>
       <w:pPr>
         <w:pStyle w:val="Heading1"/>
       </w:pPr>
-      <w:bookmarkStart w:id="13" w:name="_Toc242791551"/>
+      <w:bookmarkStart w:id="13" w:name="_Toc242876795"/>
       <w:r>
         <w:t>13. How to maintain this report</w:t>
       </w:r>
@@ -4107,19 +4061,1043 @@
     </w:p>
     <w:p>
       <w:r>
-        <w:t>Keep the test date, Git commit, browser, result file and screenshots together. When a feature changes, update its FSD requirement and test assertions before recording new results. Traces can include form d</w:t>
+        <w:t>Keep the test date, Git commit, browser, result file and screenshots together. When a feature changes, update its FSD requireme</w:t>
       </w:r>
       <w:r>
-        <w:t>ata and are not automatically published.</w:t>
+        <w:t>nt and test assertions before recording new results. Traces can include form data and are not automatically published.</w:t>
       </w:r>
     </w:p>
     <w:p>
       <w:r>
-        <w:t>Source files: tests/e2e/application.spec.ts, landing.spec.ts, visual.spec.ts, zz-company-isolation.spec.ts, zz-feedback-reporting.spec.ts, zz-filter-ui.spec.ts, zz-platform.spec.ts, zz-skeleton.spec.ts, zz-session-n</w:t>
+        <w:t>Source files: tests/e2e/application.spec.ts, landing.spec.ts, visual.spec.ts, zz-company-isolation.spec.ts, zz-feedback-reporting.spec.ts</w:t>
       </w:r>
       <w:r>
-        <w:t>avigation.spec.ts, zz-tracking.spec.ts and zzz-onboarding.spec.ts.</w:t>
+        <w:t>, zz-filter-ui.spec.ts, zz-platform.spec.ts, zz-skeleton.spec.ts, zz-session-navigation.spec.ts, zz-tracking.spec.ts and zzz-onboarding.spec.ts.</w:t>
       </w:r>
+    </w:p>
+    <w:p>
+      <w:pPr>
+        <w:pStyle w:val="Heading1"/>
+        <w:pageBreakBefore/>
+      </w:pPr>
+      <w:bookmarkStart w:id="14" w:name="_Toc242876796"/>
+      <w:r>
+        <w:lastRenderedPageBreak/>
+        <w:t>14. Test source references</w:t>
+      </w:r>
+      <w:bookmarkEnd w:id="14"/>
+    </w:p>
+    <w:p>
+      <w:r>
+        <w:t>The original automated test names are listed here for readers who want to locate the</w:t>
+      </w:r>
+      <w:r>
+        <w:t xml:space="preserve"> checks in the code. The source files are in tests/e2e. Each ID matches the plain-language description in Table 3. File names and line numbers refer to the recorded source version.</w:t>
+      </w:r>
+    </w:p>
+    <w:p>
+      <w:pPr>
+        <w:pStyle w:val="Caption"/>
+        <w:keepNext/>
+      </w:pPr>
+      <w:r>
+        <w:t>Table 4. Test source references</w:t>
+      </w:r>
+    </w:p>
+    <w:tbl>
+      <w:tblPr>
+        <w:tblStyle w:val="LightShading-Accent1"/>
+        <w:tblW w:w="0" w:type="auto"/>
+        <w:tblLayout w:type="fixed"/>
+        <w:tblLook w:val="04A0" w:firstRow="1" w:lastRow="0" w:firstColumn="1" w:lastColumn="0" w:noHBand="0" w:noVBand="1"/>
+      </w:tblPr>
+      <w:tblGrid>
+        <w:gridCol w:w="2948"/>
+        <w:gridCol w:w="6576"/>
+      </w:tblGrid>
+      <w:tr>
+        <w:trPr>
+          <w:cnfStyle w:val="100000000000" w:firstRow="1" w:lastRow="0" w:firstColumn="0" w:lastColumn="0" w:oddVBand="0" w:evenVBand="0" w:oddHBand="0" w:evenHBand="0" w:firstRowFirstColumn="0" w:firstRowLastColumn="0" w:lastRowFirstColumn="0" w:lastRowLastColumn="0"/>
+          <w:tblHeader/>
+        </w:trPr>
+        <w:tc>
+          <w:tcPr>
+            <w:cnfStyle w:val="001000000000" w:firstRow="0" w:lastRow="0" w:firstColumn="1" w:lastColumn="0" w:oddVBand="0" w:evenVBand="0" w:oddHBand="0" w:evenHBand="0" w:firstRowFirstColumn="0" w:firstRowLastColumn="0" w:lastRowFirstColumn="0" w:lastRowLastColumn="0"/>
+            <w:tcW w:w="2948" w:type="dxa"/>
+          </w:tcPr>
+          <w:p>
+            <w:pPr>
+              <w:keepNext/>
+              <w:spacing w:after="80" w:line="252" w:lineRule="auto"/>
+            </w:pPr>
+            <w:r>
+              <w:rPr>
+                <w:sz w:val="18"/>
+              </w:rPr>
+              <w:t>ID / source file</w:t>
+            </w:r>
+          </w:p>
+        </w:tc>
+        <w:tc>
+          <w:tcPr>
+            <w:tcW w:w="6576" w:type="dxa"/>
+          </w:tcPr>
+          <w:p>
+            <w:pPr>
+              <w:keepNext/>
+              <w:spacing w:after="80" w:line="252" w:lineRule="auto"/>
+              <w:cnfStyle w:val="100000000000" w:firstRow="1" w:lastRow="0" w:firstColumn="0" w:lastColumn="0" w:oddVBand="0" w:evenVBand="0" w:oddHBand="0" w:evenHBand="0" w:firstRowFirstColumn="0" w:firstRowLastColumn="0" w:lastRowFirstColumn="0" w:lastRowLastColumn="0"/>
+            </w:pPr>
+            <w:r>
+              <w:rPr>
+                <w:sz w:val="18"/>
+              </w:rPr>
+              <w:t>Original automated test na</w:t>
+            </w:r>
+            <w:r>
+              <w:rPr>
+                <w:sz w:val="18"/>
+              </w:rPr>
+              <w:t>me</w:t>
+            </w:r>
+          </w:p>
+        </w:tc>
+      </w:tr>
+      <w:tr>
+        <w:trPr>
+          <w:cnfStyle w:val="000000100000" w:firstRow="0" w:lastRow="0" w:firstColumn="0" w:lastColumn="0" w:oddVBand="0" w:evenVBand="0" w:oddHBand="1" w:evenHBand="0" w:firstRowFirstColumn="0" w:firstRowLastColumn="0" w:lastRowFirstColumn="0" w:lastRowLastColumn="0"/>
+          <w:cantSplit/>
+        </w:trPr>
+        <w:tc>
+          <w:tcPr>
+            <w:cnfStyle w:val="001000000000" w:firstRow="0" w:lastRow="0" w:firstColumn="1" w:lastColumn="0" w:oddVBand="0" w:evenVBand="0" w:oddHBand="0" w:evenHBand="0" w:firstRowFirstColumn="0" w:firstRowLastColumn="0" w:lastRowFirstColumn="0" w:lastRowLastColumn="0"/>
+            <w:tcW w:w="2948" w:type="dxa"/>
+          </w:tcPr>
+          <w:p>
+            <w:pPr>
+              <w:spacing w:after="80" w:line="252" w:lineRule="auto"/>
+            </w:pPr>
+            <w:r>
+              <w:rPr>
+                <w:sz w:val="18"/>
+              </w:rPr>
+              <w:t>E2E-01</w:t>
+            </w:r>
+            <w:r>
+              <w:rPr>
+                <w:sz w:val="18"/>
+              </w:rPr>
+              <w:br/>
+              <w:t>application.spec.ts:6</w:t>
+            </w:r>
+          </w:p>
+        </w:tc>
+        <w:tc>
+          <w:tcPr>
+            <w:tcW w:w="6576" w:type="dxa"/>
+          </w:tcPr>
+          <w:p>
+            <w:pPr>
+              <w:spacing w:after="80" w:line="252" w:lineRule="auto"/>
+              <w:cnfStyle w:val="000000100000" w:firstRow="0" w:lastRow="0" w:firstColumn="0" w:lastColumn="0" w:oddVBand="0" w:evenVBand="0" w:oddHBand="1" w:evenHBand="0" w:firstRowFirstColumn="0" w:firstRowLastColumn="0" w:lastRowFirstColumn="0" w:lastRowLastColumn="0"/>
+            </w:pPr>
+            <w:r>
+              <w:rPr>
+                <w:sz w:val="18"/>
+              </w:rPr>
+              <w:t>successful setup with failed auto-login does not ask to create account again</w:t>
+            </w:r>
+          </w:p>
+        </w:tc>
+      </w:tr>
+      <w:tr>
+        <w:trPr>
+          <w:cantSplit/>
+        </w:trPr>
+        <w:tc>
+          <w:tcPr>
+            <w:cnfStyle w:val="001000000000" w:firstRow="0" w:lastRow="0" w:firstColumn="1" w:lastColumn="0" w:oddVBand="0" w:evenVBand="0" w:oddHBand="0" w:evenHBand="0" w:firstRowFirstColumn="0" w:firstRowLastColumn="0" w:lastRowFirstColumn="0" w:lastRowLastColumn="0"/>
+            <w:tcW w:w="2948" w:type="dxa"/>
+          </w:tcPr>
+          <w:p>
+            <w:pPr>
+              <w:spacing w:after="80" w:line="252" w:lineRule="auto"/>
+            </w:pPr>
+            <w:r>
+              <w:rPr>
+                <w:sz w:val="18"/>
+              </w:rPr>
+              <w:t>E2E-02</w:t>
+            </w:r>
+            <w:r>
+              <w:rPr>
+                <w:sz w:val="18"/>
+              </w:rPr>
+              <w:br/>
+              <w:t>application.spec.ts:40</w:t>
+            </w:r>
+          </w:p>
+        </w:tc>
+        <w:tc>
+          <w:tcPr>
+            <w:tcW w:w="6576" w:type="dxa"/>
+          </w:tcPr>
+          <w:p>
+            <w:pPr>
+              <w:spacing w:after="80" w:line="252" w:lineRule="auto"/>
+              <w:cnfStyle w:val="000000000000" w:firstRow="0" w:lastRow="0" w:firstColumn="0" w:lastColumn="0" w:oddVBand="0" w:evenVBand="0" w:oddHBand="0" w:evenHBand="0" w:firstRowFirstColumn="0" w:firstRowLastColumn="0" w:lastRowFirstColumn="0" w:lastRowLastColumn="0"/>
+            </w:pPr>
+            <w:r>
+              <w:rPr>
+                <w:sz w:val="18"/>
+              </w:rPr>
+              <w:t>setup, private admin, anonymous widget, attachments and logout</w:t>
+            </w:r>
+          </w:p>
+        </w:tc>
+      </w:tr>
+      <w:tr>
+        <w:trPr>
+          <w:cnfStyle w:val="000000100000" w:firstRow="0" w:lastRow="0" w:firstColumn="0" w:lastColumn="0" w:oddVBand="0" w:evenVBand="0" w:oddHBand="1" w:evenHBand="0" w:firstRowFirstColumn="0" w:firstRowLastColumn="0" w:lastRowFirstColumn="0" w:lastRowLastColumn="0"/>
+          <w:cantSplit/>
+        </w:trPr>
+        <w:tc>
+          <w:tcPr>
+            <w:cnfStyle w:val="001000000000" w:firstRow="0" w:lastRow="0" w:firstColumn="1" w:lastColumn="0" w:oddVBand="0" w:evenVBand="0" w:oddHBand="0" w:evenHBand="0" w:firstRowFirstColumn="0" w:firstRowLastColumn="0" w:lastRowFirstColumn="0" w:lastRowLastColumn="0"/>
+            <w:tcW w:w="2948" w:type="dxa"/>
+          </w:tcPr>
+          <w:p>
+            <w:pPr>
+              <w:spacing w:after="80" w:line="252" w:lineRule="auto"/>
+            </w:pPr>
+            <w:r>
+              <w:rPr>
+                <w:sz w:val="18"/>
+              </w:rPr>
+              <w:t>E2E-03</w:t>
+            </w:r>
+            <w:r>
+              <w:rPr>
+                <w:sz w:val="18"/>
+              </w:rPr>
+              <w:br/>
+            </w:r>
+            <w:r>
+              <w:rPr>
+                <w:sz w:val="18"/>
+              </w:rPr>
+              <w:t>application.spec.ts:194</w:t>
+            </w:r>
+          </w:p>
+        </w:tc>
+        <w:tc>
+          <w:tcPr>
+            <w:tcW w:w="6576" w:type="dxa"/>
+          </w:tcPr>
+          <w:p>
+            <w:pPr>
+              <w:spacing w:after="80" w:line="252" w:lineRule="auto"/>
+              <w:cnfStyle w:val="000000100000" w:firstRow="0" w:lastRow="0" w:firstColumn="0" w:lastColumn="0" w:oddVBand="0" w:evenVBand="0" w:oddHBand="1" w:evenHBand="0" w:firstRowFirstColumn="0" w:firstRowLastColumn="0" w:lastRowFirstColumn="0" w:lastRowLastColumn="0"/>
+            </w:pPr>
+            <w:r>
+              <w:rPr>
+                <w:sz w:val="18"/>
+              </w:rPr>
+              <w:t>anonymous retries, conflicting payloads, invalid files and request limits</w:t>
+            </w:r>
+          </w:p>
+        </w:tc>
+      </w:tr>
+      <w:tr>
+        <w:trPr>
+          <w:cantSplit/>
+        </w:trPr>
+        <w:tc>
+          <w:tcPr>
+            <w:cnfStyle w:val="001000000000" w:firstRow="0" w:lastRow="0" w:firstColumn="1" w:lastColumn="0" w:oddVBand="0" w:evenVBand="0" w:oddHBand="0" w:evenHBand="0" w:firstRowFirstColumn="0" w:firstRowLastColumn="0" w:lastRowFirstColumn="0" w:lastRowLastColumn="0"/>
+            <w:tcW w:w="2948" w:type="dxa"/>
+          </w:tcPr>
+          <w:p>
+            <w:pPr>
+              <w:spacing w:after="80" w:line="252" w:lineRule="auto"/>
+            </w:pPr>
+            <w:r>
+              <w:rPr>
+                <w:sz w:val="18"/>
+              </w:rPr>
+              <w:t>E2E-04</w:t>
+            </w:r>
+            <w:r>
+              <w:rPr>
+                <w:sz w:val="18"/>
+              </w:rPr>
+              <w:br/>
+              <w:t>landing.spec.ts:4</w:t>
+            </w:r>
+          </w:p>
+        </w:tc>
+        <w:tc>
+          <w:tcPr>
+            <w:tcW w:w="6576" w:type="dxa"/>
+          </w:tcPr>
+          <w:p>
+            <w:pPr>
+              <w:spacing w:after="80" w:line="252" w:lineRule="auto"/>
+              <w:cnfStyle w:val="000000000000" w:firstRow="0" w:lastRow="0" w:firstColumn="0" w:lastColumn="0" w:oddVBand="0" w:evenVBand="0" w:oddHBand="0" w:evenHBand="0" w:firstRowFirstColumn="0" w:firstRowLastColumn="0" w:lastRowFirstColumn="0" w:lastRowLastColumn="0"/>
+            </w:pPr>
+            <w:r>
+              <w:rPr>
+                <w:sz w:val="18"/>
+              </w:rPr>
+              <w:t>landing motion settles after rapid interaction and respects reduced motion</w:t>
+            </w:r>
+          </w:p>
+        </w:tc>
+      </w:tr>
+      <w:tr>
+        <w:trPr>
+          <w:cnfStyle w:val="000000100000" w:firstRow="0" w:lastRow="0" w:firstColumn="0" w:lastColumn="0" w:oddVBand="0" w:evenVBand="0" w:oddHBand="1" w:evenHBand="0" w:firstRowFirstColumn="0" w:firstRowLastColumn="0" w:lastRowFirstColumn="0" w:lastRowLastColumn="0"/>
+          <w:cantSplit/>
+        </w:trPr>
+        <w:tc>
+          <w:tcPr>
+            <w:cnfStyle w:val="001000000000" w:firstRow="0" w:lastRow="0" w:firstColumn="1" w:lastColumn="0" w:oddVBand="0" w:evenVBand="0" w:oddHBand="0" w:evenHBand="0" w:firstRowFirstColumn="0" w:firstRowLastColumn="0" w:lastRowFirstColumn="0" w:lastRowLastColumn="0"/>
+            <w:tcW w:w="2948" w:type="dxa"/>
+          </w:tcPr>
+          <w:p>
+            <w:pPr>
+              <w:spacing w:after="80" w:line="252" w:lineRule="auto"/>
+            </w:pPr>
+            <w:r>
+              <w:rPr>
+                <w:sz w:val="18"/>
+              </w:rPr>
+              <w:t>E2E-05</w:t>
+            </w:r>
+            <w:r>
+              <w:rPr>
+                <w:sz w:val="18"/>
+              </w:rPr>
+              <w:br/>
+              <w:t>landing.spec.ts:52</w:t>
+            </w:r>
+          </w:p>
+        </w:tc>
+        <w:tc>
+          <w:tcPr>
+            <w:tcW w:w="6576" w:type="dxa"/>
+          </w:tcPr>
+          <w:p>
+            <w:pPr>
+              <w:spacing w:after="80" w:line="252" w:lineRule="auto"/>
+              <w:cnfStyle w:val="000000100000" w:firstRow="0" w:lastRow="0" w:firstColumn="0" w:lastColumn="0" w:oddVBand="0" w:evenVBand="0" w:oddHBand="1" w:evenHBand="0" w:firstRowFirstColumn="0" w:firstRowLastColumn="0" w:lastRowFirstColumn="0" w:lastRowLastColumn="0"/>
+            </w:pPr>
+            <w:r>
+              <w:rPr>
+                <w:sz w:val="18"/>
+              </w:rPr>
+              <w:t>completed entrances remain set</w:t>
+            </w:r>
+            <w:r>
+              <w:rPr>
+                <w:sz w:val="18"/>
+              </w:rPr>
+              <w:t>tled across resizing and preference changes</w:t>
+            </w:r>
+          </w:p>
+        </w:tc>
+      </w:tr>
+      <w:tr>
+        <w:trPr>
+          <w:cantSplit/>
+        </w:trPr>
+        <w:tc>
+          <w:tcPr>
+            <w:cnfStyle w:val="001000000000" w:firstRow="0" w:lastRow="0" w:firstColumn="1" w:lastColumn="0" w:oddVBand="0" w:evenVBand="0" w:oddHBand="0" w:evenHBand="0" w:firstRowFirstColumn="0" w:firstRowLastColumn="0" w:lastRowFirstColumn="0" w:lastRowLastColumn="0"/>
+            <w:tcW w:w="2948" w:type="dxa"/>
+          </w:tcPr>
+          <w:p>
+            <w:pPr>
+              <w:spacing w:after="80" w:line="252" w:lineRule="auto"/>
+            </w:pPr>
+            <w:r>
+              <w:rPr>
+                <w:sz w:val="18"/>
+              </w:rPr>
+              <w:t>E2E-06</w:t>
+            </w:r>
+            <w:r>
+              <w:rPr>
+                <w:sz w:val="18"/>
+              </w:rPr>
+              <w:br/>
+              <w:t>landing.spec.ts:94</w:t>
+            </w:r>
+          </w:p>
+        </w:tc>
+        <w:tc>
+          <w:tcPr>
+            <w:tcW w:w="6576" w:type="dxa"/>
+          </w:tcPr>
+          <w:p>
+            <w:pPr>
+              <w:spacing w:after="80" w:line="252" w:lineRule="auto"/>
+              <w:cnfStyle w:val="000000000000" w:firstRow="0" w:lastRow="0" w:firstColumn="0" w:lastColumn="0" w:oddVBand="0" w:evenVBand="0" w:oddHBand="0" w:evenHBand="0" w:firstRowFirstColumn="0" w:firstRowLastColumn="0" w:lastRowFirstColumn="0" w:lastRowLastColumn="0"/>
+            </w:pPr>
+            <w:r>
+              <w:rPr>
+                <w:sz w:val="18"/>
+              </w:rPr>
+              <w:t>widget illustration contents fit at intermediate widths</w:t>
+            </w:r>
+          </w:p>
+        </w:tc>
+      </w:tr>
+      <w:tr>
+        <w:trPr>
+          <w:cnfStyle w:val="000000100000" w:firstRow="0" w:lastRow="0" w:firstColumn="0" w:lastColumn="0" w:oddVBand="0" w:evenVBand="0" w:oddHBand="1" w:evenHBand="0" w:firstRowFirstColumn="0" w:firstRowLastColumn="0" w:lastRowFirstColumn="0" w:lastRowLastColumn="0"/>
+          <w:cantSplit/>
+        </w:trPr>
+        <w:tc>
+          <w:tcPr>
+            <w:cnfStyle w:val="001000000000" w:firstRow="0" w:lastRow="0" w:firstColumn="1" w:lastColumn="0" w:oddVBand="0" w:evenVBand="0" w:oddHBand="0" w:evenHBand="0" w:firstRowFirstColumn="0" w:firstRowLastColumn="0" w:lastRowFirstColumn="0" w:lastRowLastColumn="0"/>
+            <w:tcW w:w="2948" w:type="dxa"/>
+          </w:tcPr>
+          <w:p>
+            <w:pPr>
+              <w:spacing w:after="80" w:line="252" w:lineRule="auto"/>
+            </w:pPr>
+            <w:r>
+              <w:rPr>
+                <w:sz w:val="18"/>
+              </w:rPr>
+              <w:t>E2E-07</w:t>
+            </w:r>
+            <w:r>
+              <w:rPr>
+                <w:sz w:val="18"/>
+              </w:rPr>
+              <w:br/>
+              <w:t>landing.spec.ts:111</w:t>
+            </w:r>
+          </w:p>
+        </w:tc>
+        <w:tc>
+          <w:tcPr>
+            <w:tcW w:w="6576" w:type="dxa"/>
+          </w:tcPr>
+          <w:p>
+            <w:pPr>
+              <w:spacing w:after="80" w:line="252" w:lineRule="auto"/>
+              <w:cnfStyle w:val="000000100000" w:firstRow="0" w:lastRow="0" w:firstColumn="0" w:lastColumn="0" w:oddVBand="0" w:evenVBand="0" w:oddHBand="1" w:evenHBand="0" w:firstRowFirstColumn="0" w:firstRowLastColumn="0" w:lastRowFirstColumn="0" w:lastRowLastColumn="0"/>
+            </w:pPr>
+            <w:r>
+              <w:rPr>
+                <w:sz w:val="18"/>
+              </w:rPr>
+              <w:t>public landing demo never writes feedback and works on mobile</w:t>
+            </w:r>
+          </w:p>
+        </w:tc>
+      </w:tr>
+      <w:tr>
+        <w:trPr>
+          <w:cantSplit/>
+        </w:trPr>
+        <w:tc>
+          <w:tcPr>
+            <w:cnfStyle w:val="001000000000" w:firstRow="0" w:lastRow="0" w:firstColumn="1" w:lastColumn="0" w:oddVBand="0" w:evenVBand="0" w:oddHBand="0" w:evenHBand="0" w:firstRowFirstColumn="0" w:firstRowLastColumn="0" w:lastRowFirstColumn="0" w:lastRowLastColumn="0"/>
+            <w:tcW w:w="2948" w:type="dxa"/>
+          </w:tcPr>
+          <w:p>
+            <w:pPr>
+              <w:spacing w:after="80" w:line="252" w:lineRule="auto"/>
+            </w:pPr>
+            <w:r>
+              <w:rPr>
+                <w:sz w:val="18"/>
+              </w:rPr>
+              <w:t>E2E-08</w:t>
+            </w:r>
+            <w:r>
+              <w:rPr>
+                <w:sz w:val="18"/>
+              </w:rPr>
+              <w:br/>
+            </w:r>
+            <w:r>
+              <w:rPr>
+                <w:sz w:val="18"/>
+              </w:rPr>
+              <w:t>visual.spec.ts:6</w:t>
+            </w:r>
+          </w:p>
+        </w:tc>
+        <w:tc>
+          <w:tcPr>
+            <w:tcW w:w="6576" w:type="dxa"/>
+          </w:tcPr>
+          <w:p>
+            <w:pPr>
+              <w:spacing w:after="80" w:line="252" w:lineRule="auto"/>
+              <w:cnfStyle w:val="000000000000" w:firstRow="0" w:lastRow="0" w:firstColumn="0" w:lastColumn="0" w:oddVBand="0" w:evenVBand="0" w:oddHBand="0" w:evenHBand="0" w:firstRowFirstColumn="0" w:firstRowLastColumn="0" w:lastRowFirstColumn="0" w:lastRowLastColumn="0"/>
+            </w:pPr>
+            <w:r>
+              <w:rPr>
+                <w:sz w:val="18"/>
+              </w:rPr>
+              <w:t>website list and add form align side-by-side on desktop and stack on mobile</w:t>
+            </w:r>
+          </w:p>
+        </w:tc>
+      </w:tr>
+      <w:tr>
+        <w:trPr>
+          <w:cnfStyle w:val="000000100000" w:firstRow="0" w:lastRow="0" w:firstColumn="0" w:lastColumn="0" w:oddVBand="0" w:evenVBand="0" w:oddHBand="1" w:evenHBand="0" w:firstRowFirstColumn="0" w:firstRowLastColumn="0" w:lastRowFirstColumn="0" w:lastRowLastColumn="0"/>
+          <w:cantSplit/>
+        </w:trPr>
+        <w:tc>
+          <w:tcPr>
+            <w:cnfStyle w:val="001000000000" w:firstRow="0" w:lastRow="0" w:firstColumn="1" w:lastColumn="0" w:oddVBand="0" w:evenVBand="0" w:oddHBand="0" w:evenHBand="0" w:firstRowFirstColumn="0" w:firstRowLastColumn="0" w:lastRowFirstColumn="0" w:lastRowLastColumn="0"/>
+            <w:tcW w:w="2948" w:type="dxa"/>
+          </w:tcPr>
+          <w:p>
+            <w:pPr>
+              <w:spacing w:after="80" w:line="252" w:lineRule="auto"/>
+            </w:pPr>
+            <w:r>
+              <w:rPr>
+                <w:sz w:val="18"/>
+              </w:rPr>
+              <w:t>E2E-09</w:t>
+            </w:r>
+            <w:r>
+              <w:rPr>
+                <w:sz w:val="18"/>
+              </w:rPr>
+              <w:br/>
+              <w:t>visual.spec.ts:28</w:t>
+            </w:r>
+          </w:p>
+        </w:tc>
+        <w:tc>
+          <w:tcPr>
+            <w:tcW w:w="6576" w:type="dxa"/>
+          </w:tcPr>
+          <w:p>
+            <w:pPr>
+              <w:spacing w:after="80" w:line="252" w:lineRule="auto"/>
+              <w:cnfStyle w:val="000000100000" w:firstRow="0" w:lastRow="0" w:firstColumn="0" w:lastColumn="0" w:oddVBand="0" w:evenVBand="0" w:oddHBand="1" w:evenHBand="0" w:firstRowFirstColumn="0" w:firstRowLastColumn="0" w:lastRowFirstColumn="0" w:lastRowLastColumn="0"/>
+            </w:pPr>
+            <w:r>
+              <w:rPr>
+                <w:sz w:val="18"/>
+              </w:rPr>
+              <w:t>desktop and mobile workspace render without overflow</w:t>
+            </w:r>
+          </w:p>
+        </w:tc>
+      </w:tr>
+      <w:tr>
+        <w:trPr>
+          <w:cantSplit/>
+        </w:trPr>
+        <w:tc>
+          <w:tcPr>
+            <w:cnfStyle w:val="001000000000" w:firstRow="0" w:lastRow="0" w:firstColumn="1" w:lastColumn="0" w:oddVBand="0" w:evenVBand="0" w:oddHBand="0" w:evenHBand="0" w:firstRowFirstColumn="0" w:firstRowLastColumn="0" w:lastRowFirstColumn="0" w:lastRowLastColumn="0"/>
+            <w:tcW w:w="2948" w:type="dxa"/>
+          </w:tcPr>
+          <w:p>
+            <w:pPr>
+              <w:spacing w:after="80" w:line="252" w:lineRule="auto"/>
+            </w:pPr>
+            <w:r>
+              <w:rPr>
+                <w:sz w:val="18"/>
+              </w:rPr>
+              <w:t>E2E-10</w:t>
+            </w:r>
+            <w:r>
+              <w:rPr>
+                <w:sz w:val="18"/>
+              </w:rPr>
+              <w:br/>
+              <w:t>visual.spec.ts:62</w:t>
+            </w:r>
+          </w:p>
+        </w:tc>
+        <w:tc>
+          <w:tcPr>
+            <w:tcW w:w="6576" w:type="dxa"/>
+          </w:tcPr>
+          <w:p>
+            <w:pPr>
+              <w:spacing w:after="80" w:line="252" w:lineRule="auto"/>
+              <w:cnfStyle w:val="000000000000" w:firstRow="0" w:lastRow="0" w:firstColumn="0" w:lastColumn="0" w:oddVBand="0" w:evenVBand="0" w:oddHBand="0" w:evenHBand="0" w:firstRowFirstColumn="0" w:firstRowLastColumn="0" w:lastRowFirstColumn="0" w:lastRowLastColumn="0"/>
+            </w:pPr>
+            <w:r>
+              <w:rPr>
+                <w:sz w:val="18"/>
+              </w:rPr>
+              <w:t xml:space="preserve">search, filters, settings persistence and public </w:t>
+            </w:r>
+            <w:r>
+              <w:rPr>
+                <w:sz w:val="18"/>
+              </w:rPr>
+              <w:t>widget configuration</w:t>
+            </w:r>
+          </w:p>
+        </w:tc>
+      </w:tr>
+      <w:tr>
+        <w:trPr>
+          <w:cnfStyle w:val="000000100000" w:firstRow="0" w:lastRow="0" w:firstColumn="0" w:lastColumn="0" w:oddVBand="0" w:evenVBand="0" w:oddHBand="1" w:evenHBand="0" w:firstRowFirstColumn="0" w:firstRowLastColumn="0" w:lastRowFirstColumn="0" w:lastRowLastColumn="0"/>
+          <w:cantSplit/>
+        </w:trPr>
+        <w:tc>
+          <w:tcPr>
+            <w:cnfStyle w:val="001000000000" w:firstRow="0" w:lastRow="0" w:firstColumn="1" w:lastColumn="0" w:oddVBand="0" w:evenVBand="0" w:oddHBand="0" w:evenHBand="0" w:firstRowFirstColumn="0" w:firstRowLastColumn="0" w:lastRowFirstColumn="0" w:lastRowLastColumn="0"/>
+            <w:tcW w:w="2948" w:type="dxa"/>
+          </w:tcPr>
+          <w:p>
+            <w:pPr>
+              <w:spacing w:after="80" w:line="252" w:lineRule="auto"/>
+            </w:pPr>
+            <w:r>
+              <w:rPr>
+                <w:sz w:val="18"/>
+              </w:rPr>
+              <w:t>E2E-11</w:t>
+            </w:r>
+            <w:r>
+              <w:rPr>
+                <w:sz w:val="18"/>
+              </w:rPr>
+              <w:br/>
+              <w:t>visual.spec.ts:145</w:t>
+            </w:r>
+          </w:p>
+        </w:tc>
+        <w:tc>
+          <w:tcPr>
+            <w:tcW w:w="6576" w:type="dxa"/>
+          </w:tcPr>
+          <w:p>
+            <w:pPr>
+              <w:spacing w:after="80" w:line="252" w:lineRule="auto"/>
+              <w:cnfStyle w:val="000000100000" w:firstRow="0" w:lastRow="0" w:firstColumn="0" w:lastColumn="0" w:oddVBand="0" w:evenVBand="0" w:oddHBand="1" w:evenHBand="0" w:firstRowFirstColumn="0" w:firstRowLastColumn="0" w:lastRowFirstColumn="0" w:lastRowLastColumn="0"/>
+            </w:pPr>
+            <w:r>
+              <w:rPr>
+                <w:sz w:val="18"/>
+              </w:rPr>
+              <w:t>widget key rotation requires confirmation and retires old key without deleting reports</w:t>
+            </w:r>
+          </w:p>
+        </w:tc>
+      </w:tr>
+      <w:tr>
+        <w:trPr>
+          <w:cantSplit/>
+        </w:trPr>
+        <w:tc>
+          <w:tcPr>
+            <w:cnfStyle w:val="001000000000" w:firstRow="0" w:lastRow="0" w:firstColumn="1" w:lastColumn="0" w:oddVBand="0" w:evenVBand="0" w:oddHBand="0" w:evenHBand="0" w:firstRowFirstColumn="0" w:firstRowLastColumn="0" w:lastRowFirstColumn="0" w:lastRowLastColumn="0"/>
+            <w:tcW w:w="2948" w:type="dxa"/>
+          </w:tcPr>
+          <w:p>
+            <w:pPr>
+              <w:spacing w:after="80" w:line="252" w:lineRule="auto"/>
+            </w:pPr>
+            <w:r>
+              <w:rPr>
+                <w:sz w:val="18"/>
+              </w:rPr>
+              <w:t>E2E-12</w:t>
+            </w:r>
+            <w:r>
+              <w:rPr>
+                <w:sz w:val="18"/>
+              </w:rPr>
+              <w:br/>
+              <w:t>zz-company-isolation.spec.ts:9</w:t>
+            </w:r>
+          </w:p>
+        </w:tc>
+        <w:tc>
+          <w:tcPr>
+            <w:tcW w:w="6576" w:type="dxa"/>
+          </w:tcPr>
+          <w:p>
+            <w:pPr>
+              <w:spacing w:after="80" w:line="252" w:lineRule="auto"/>
+              <w:cnfStyle w:val="000000000000" w:firstRow="0" w:lastRow="0" w:firstColumn="0" w:lastColumn="0" w:oddVBand="0" w:evenVBand="0" w:oddHBand="0" w:evenHBand="0" w:firstRowFirstColumn="0" w:firstRowLastColumn="0" w:lastRowFirstColumn="0" w:lastRowLastColumn="0"/>
+            </w:pPr>
+            <w:r>
+              <w:rPr>
+                <w:sz w:val="18"/>
+              </w:rPr>
+              <w:t>Company API and legacy routes reject foreign reports, notes, attachments and platf</w:t>
+            </w:r>
+            <w:r>
+              <w:rPr>
+                <w:sz w:val="18"/>
+              </w:rPr>
+              <w:t>orm-only access</w:t>
+            </w:r>
+          </w:p>
+        </w:tc>
+      </w:tr>
+      <w:tr>
+        <w:trPr>
+          <w:cnfStyle w:val="000000100000" w:firstRow="0" w:lastRow="0" w:firstColumn="0" w:lastColumn="0" w:oddVBand="0" w:evenVBand="0" w:oddHBand="1" w:evenHBand="0" w:firstRowFirstColumn="0" w:firstRowLastColumn="0" w:lastRowFirstColumn="0" w:lastRowLastColumn="0"/>
+          <w:cantSplit/>
+        </w:trPr>
+        <w:tc>
+          <w:tcPr>
+            <w:cnfStyle w:val="001000000000" w:firstRow="0" w:lastRow="0" w:firstColumn="1" w:lastColumn="0" w:oddVBand="0" w:evenVBand="0" w:oddHBand="0" w:evenHBand="0" w:firstRowFirstColumn="0" w:firstRowLastColumn="0" w:lastRowFirstColumn="0" w:lastRowLastColumn="0"/>
+            <w:tcW w:w="2948" w:type="dxa"/>
+          </w:tcPr>
+          <w:p>
+            <w:pPr>
+              <w:spacing w:after="80" w:line="252" w:lineRule="auto"/>
+            </w:pPr>
+            <w:r>
+              <w:rPr>
+                <w:sz w:val="18"/>
+              </w:rPr>
+              <w:t>E2E-13</w:t>
+            </w:r>
+            <w:r>
+              <w:rPr>
+                <w:sz w:val="18"/>
+              </w:rPr>
+              <w:br/>
+              <w:t>zz-feedback-reporting.spec.ts:5</w:t>
+            </w:r>
+          </w:p>
+        </w:tc>
+        <w:tc>
+          <w:tcPr>
+            <w:tcW w:w="6576" w:type="dxa"/>
+          </w:tcPr>
+          <w:p>
+            <w:pPr>
+              <w:spacing w:after="80" w:line="252" w:lineRule="auto"/>
+              <w:cnfStyle w:val="000000100000" w:firstRow="0" w:lastRow="0" w:firstColumn="0" w:lastColumn="0" w:oddVBand="0" w:evenVBand="0" w:oddHBand="1" w:evenHBand="0" w:firstRowFirstColumn="0" w:firstRowLastColumn="0" w:lastRowFirstColumn="0" w:lastRowLastColumn="0"/>
+            </w:pPr>
+            <w:r>
+              <w:rPr>
+                <w:sz w:val="18"/>
+              </w:rPr>
+              <w:t>Company monthly line chart and three Excel periods match aggregate data</w:t>
+            </w:r>
+          </w:p>
+        </w:tc>
+      </w:tr>
+      <w:tr>
+        <w:trPr>
+          <w:cantSplit/>
+        </w:trPr>
+        <w:tc>
+          <w:tcPr>
+            <w:cnfStyle w:val="001000000000" w:firstRow="0" w:lastRow="0" w:firstColumn="1" w:lastColumn="0" w:oddVBand="0" w:evenVBand="0" w:oddHBand="0" w:evenHBand="0" w:firstRowFirstColumn="0" w:firstRowLastColumn="0" w:lastRowFirstColumn="0" w:lastRowLastColumn="0"/>
+            <w:tcW w:w="2948" w:type="dxa"/>
+          </w:tcPr>
+          <w:p>
+            <w:pPr>
+              <w:spacing w:after="80" w:line="252" w:lineRule="auto"/>
+            </w:pPr>
+            <w:r>
+              <w:rPr>
+                <w:sz w:val="18"/>
+              </w:rPr>
+              <w:t>E2E-14</w:t>
+            </w:r>
+            <w:r>
+              <w:rPr>
+                <w:sz w:val="18"/>
+              </w:rPr>
+              <w:br/>
+              <w:t>zz-filter-ui.spec.ts:3</w:t>
+            </w:r>
+          </w:p>
+        </w:tc>
+        <w:tc>
+          <w:tcPr>
+            <w:tcW w:w="6576" w:type="dxa"/>
+          </w:tcPr>
+          <w:p>
+            <w:pPr>
+              <w:spacing w:after="80" w:line="252" w:lineRule="auto"/>
+              <w:cnfStyle w:val="000000000000" w:firstRow="0" w:lastRow="0" w:firstColumn="0" w:lastColumn="0" w:oddVBand="0" w:evenVBand="0" w:oddHBand="0" w:evenHBand="0" w:firstRowFirstColumn="0" w:firstRowLastColumn="0" w:lastRowFirstColumn="0" w:lastRowLastColumn="0"/>
+            </w:pPr>
+            <w:r>
+              <w:rPr>
+                <w:sz w:val="18"/>
+              </w:rPr>
+              <w:t>filter popover floats without shifting table and preserves URL context</w:t>
+            </w:r>
+          </w:p>
+        </w:tc>
+      </w:tr>
+      <w:tr>
+        <w:trPr>
+          <w:cnfStyle w:val="000000100000" w:firstRow="0" w:lastRow="0" w:firstColumn="0" w:lastColumn="0" w:oddVBand="0" w:evenVBand="0" w:oddHBand="1" w:evenHBand="0" w:firstRowFirstColumn="0" w:firstRowLastColumn="0" w:lastRowFirstColumn="0" w:lastRowLastColumn="0"/>
+          <w:cantSplit/>
+        </w:trPr>
+        <w:tc>
+          <w:tcPr>
+            <w:cnfStyle w:val="001000000000" w:firstRow="0" w:lastRow="0" w:firstColumn="1" w:lastColumn="0" w:oddVBand="0" w:evenVBand="0" w:oddHBand="0" w:evenHBand="0" w:firstRowFirstColumn="0" w:firstRowLastColumn="0" w:lastRowFirstColumn="0" w:lastRowLastColumn="0"/>
+            <w:tcW w:w="2948" w:type="dxa"/>
+          </w:tcPr>
+          <w:p>
+            <w:pPr>
+              <w:spacing w:after="80" w:line="252" w:lineRule="auto"/>
+            </w:pPr>
+            <w:r>
+              <w:rPr>
+                <w:sz w:val="18"/>
+              </w:rPr>
+              <w:t>E2E-15</w:t>
+            </w:r>
+            <w:r>
+              <w:rPr>
+                <w:sz w:val="18"/>
+              </w:rPr>
+              <w:br/>
+              <w:t>zz-platform.spec.t</w:t>
+            </w:r>
+            <w:r>
+              <w:rPr>
+                <w:sz w:val="18"/>
+              </w:rPr>
+              <w:t>s:3</w:t>
+            </w:r>
+          </w:p>
+        </w:tc>
+        <w:tc>
+          <w:tcPr>
+            <w:tcW w:w="6576" w:type="dxa"/>
+          </w:tcPr>
+          <w:p>
+            <w:pPr>
+              <w:spacing w:after="80" w:line="252" w:lineRule="auto"/>
+              <w:cnfStyle w:val="000000100000" w:firstRow="0" w:lastRow="0" w:firstColumn="0" w:lastColumn="0" w:oddVBand="0" w:evenVBand="0" w:oddHBand="1" w:evenHBand="0" w:firstRowFirstColumn="0" w:firstRowLastColumn="0" w:lastRowFirstColumn="0" w:lastRowLastColumn="0"/>
+            </w:pPr>
+            <w:r>
+              <w:rPr>
+                <w:sz w:val="18"/>
+              </w:rPr>
+              <w:t>platform owner has separate console, real metadata and audited Company management</w:t>
+            </w:r>
+          </w:p>
+        </w:tc>
+      </w:tr>
+      <w:tr>
+        <w:trPr>
+          <w:cantSplit/>
+        </w:trPr>
+        <w:tc>
+          <w:tcPr>
+            <w:cnfStyle w:val="001000000000" w:firstRow="0" w:lastRow="0" w:firstColumn="1" w:lastColumn="0" w:oddVBand="0" w:evenVBand="0" w:oddHBand="0" w:evenHBand="0" w:firstRowFirstColumn="0" w:firstRowLastColumn="0" w:lastRowFirstColumn="0" w:lastRowLastColumn="0"/>
+            <w:tcW w:w="2948" w:type="dxa"/>
+          </w:tcPr>
+          <w:p>
+            <w:pPr>
+              <w:spacing w:after="80" w:line="252" w:lineRule="auto"/>
+            </w:pPr>
+            <w:r>
+              <w:rPr>
+                <w:sz w:val="18"/>
+              </w:rPr>
+              <w:t>E2E-16</w:t>
+            </w:r>
+            <w:r>
+              <w:rPr>
+                <w:sz w:val="18"/>
+              </w:rPr>
+              <w:br/>
+              <w:t>zz-session-navigation.spec.ts:3</w:t>
+            </w:r>
+          </w:p>
+        </w:tc>
+        <w:tc>
+          <w:tcPr>
+            <w:tcW w:w="6576" w:type="dxa"/>
+          </w:tcPr>
+          <w:p>
+            <w:pPr>
+              <w:spacing w:after="80" w:line="252" w:lineRule="auto"/>
+              <w:cnfStyle w:val="000000000000" w:firstRow="0" w:lastRow="0" w:firstColumn="0" w:lastColumn="0" w:oddVBand="0" w:evenVBand="0" w:oddHBand="0" w:evenHBand="0" w:firstRowFirstColumn="0" w:firstRowLastColumn="0" w:lastRowFirstColumn="0" w:lastRowLastColumn="0"/>
+            </w:pPr>
+            <w:r>
+              <w:rPr>
+                <w:sz w:val="18"/>
+              </w:rPr>
+              <w:t>landing and login recognize current owner session and revoked cookies</w:t>
+            </w:r>
+          </w:p>
+        </w:tc>
+      </w:tr>
+      <w:tr>
+        <w:trPr>
+          <w:cnfStyle w:val="000000100000" w:firstRow="0" w:lastRow="0" w:firstColumn="0" w:lastColumn="0" w:oddVBand="0" w:evenVBand="0" w:oddHBand="1" w:evenHBand="0" w:firstRowFirstColumn="0" w:firstRowLastColumn="0" w:lastRowFirstColumn="0" w:lastRowLastColumn="0"/>
+          <w:cantSplit/>
+        </w:trPr>
+        <w:tc>
+          <w:tcPr>
+            <w:cnfStyle w:val="001000000000" w:firstRow="0" w:lastRow="0" w:firstColumn="1" w:lastColumn="0" w:oddVBand="0" w:evenVBand="0" w:oddHBand="0" w:evenHBand="0" w:firstRowFirstColumn="0" w:firstRowLastColumn="0" w:lastRowFirstColumn="0" w:lastRowLastColumn="0"/>
+            <w:tcW w:w="2948" w:type="dxa"/>
+          </w:tcPr>
+          <w:p>
+            <w:pPr>
+              <w:spacing w:after="80" w:line="252" w:lineRule="auto"/>
+            </w:pPr>
+            <w:r>
+              <w:rPr>
+                <w:sz w:val="18"/>
+              </w:rPr>
+              <w:t>E2E-17</w:t>
+            </w:r>
+            <w:r>
+              <w:rPr>
+                <w:sz w:val="18"/>
+              </w:rPr>
+              <w:br/>
+              <w:t>zz-skeleton.spec.ts:3</w:t>
+            </w:r>
+          </w:p>
+        </w:tc>
+        <w:tc>
+          <w:tcPr>
+            <w:tcW w:w="6576" w:type="dxa"/>
+          </w:tcPr>
+          <w:p>
+            <w:pPr>
+              <w:spacing w:after="80" w:line="252" w:lineRule="auto"/>
+              <w:cnfStyle w:val="000000100000" w:firstRow="0" w:lastRow="0" w:firstColumn="0" w:lastColumn="0" w:oddVBand="0" w:evenVBand="0" w:oddHBand="1" w:evenHBand="0" w:firstRowFirstColumn="0" w:firstRowLastColumn="0" w:lastRowFirstColumn="0" w:lastRowLastColumn="0"/>
+            </w:pPr>
+            <w:r>
+              <w:rPr>
+                <w:sz w:val="18"/>
+              </w:rPr>
+              <w:t xml:space="preserve">data skeletons remain </w:t>
+            </w:r>
+            <w:r>
+              <w:rPr>
+                <w:sz w:val="18"/>
+              </w:rPr>
+              <w:t>until response, disappear on success/error and respect reduced motion</w:t>
+            </w:r>
+          </w:p>
+        </w:tc>
+      </w:tr>
+      <w:tr>
+        <w:trPr>
+          <w:cantSplit/>
+        </w:trPr>
+        <w:tc>
+          <w:tcPr>
+            <w:cnfStyle w:val="001000000000" w:firstRow="0" w:lastRow="0" w:firstColumn="1" w:lastColumn="0" w:oddVBand="0" w:evenVBand="0" w:oddHBand="0" w:evenHBand="0" w:firstRowFirstColumn="0" w:firstRowLastColumn="0" w:lastRowFirstColumn="0" w:lastRowLastColumn="0"/>
+            <w:tcW w:w="2948" w:type="dxa"/>
+          </w:tcPr>
+          <w:p>
+            <w:pPr>
+              <w:spacing w:after="80" w:line="252" w:lineRule="auto"/>
+            </w:pPr>
+            <w:r>
+              <w:rPr>
+                <w:sz w:val="18"/>
+              </w:rPr>
+              <w:t>E2E-18</w:t>
+            </w:r>
+            <w:r>
+              <w:rPr>
+                <w:sz w:val="18"/>
+              </w:rPr>
+              <w:br/>
+              <w:t>zz-tracking.spec.ts:8</w:t>
+            </w:r>
+          </w:p>
+        </w:tc>
+        <w:tc>
+          <w:tcPr>
+            <w:tcW w:w="6576" w:type="dxa"/>
+          </w:tcPr>
+          <w:p>
+            <w:pPr>
+              <w:spacing w:after="80" w:line="252" w:lineRule="auto"/>
+              <w:cnfStyle w:val="000000000000" w:firstRow="0" w:lastRow="0" w:firstColumn="0" w:lastColumn="0" w:oddVBand="0" w:evenVBand="0" w:oddHBand="0" w:evenHBand="0" w:firstRowFirstColumn="0" w:firstRowLastColumn="0" w:lastRowFirstColumn="0" w:lastRowLastColumn="0"/>
+            </w:pPr>
+            <w:r>
+              <w:rPr>
+                <w:sz w:val="18"/>
+              </w:rPr>
+              <w:t>visitor tracks an anonymous report and sees public replies but never internal notes</w:t>
+            </w:r>
+          </w:p>
+        </w:tc>
+      </w:tr>
+      <w:tr>
+        <w:trPr>
+          <w:cnfStyle w:val="000000100000" w:firstRow="0" w:lastRow="0" w:firstColumn="0" w:lastColumn="0" w:oddVBand="0" w:evenVBand="0" w:oddHBand="1" w:evenHBand="0" w:firstRowFirstColumn="0" w:firstRowLastColumn="0" w:lastRowFirstColumn="0" w:lastRowLastColumn="0"/>
+          <w:cantSplit/>
+        </w:trPr>
+        <w:tc>
+          <w:tcPr>
+            <w:cnfStyle w:val="001000000000" w:firstRow="0" w:lastRow="0" w:firstColumn="1" w:lastColumn="0" w:oddVBand="0" w:evenVBand="0" w:oddHBand="0" w:evenHBand="0" w:firstRowFirstColumn="0" w:firstRowLastColumn="0" w:lastRowFirstColumn="0" w:lastRowLastColumn="0"/>
+            <w:tcW w:w="2948" w:type="dxa"/>
+          </w:tcPr>
+          <w:p>
+            <w:pPr>
+              <w:spacing w:after="80" w:line="252" w:lineRule="auto"/>
+            </w:pPr>
+            <w:r>
+              <w:rPr>
+                <w:sz w:val="18"/>
+              </w:rPr>
+              <w:t>E2E-19</w:t>
+            </w:r>
+            <w:r>
+              <w:rPr>
+                <w:sz w:val="18"/>
+              </w:rPr>
+              <w:br/>
+              <w:t>zzz-onboarding.spec.ts:8</w:t>
+            </w:r>
+          </w:p>
+        </w:tc>
+        <w:tc>
+          <w:tcPr>
+            <w:tcW w:w="6576" w:type="dxa"/>
+          </w:tcPr>
+          <w:p>
+            <w:pPr>
+              <w:spacing w:after="80" w:line="252" w:lineRule="auto"/>
+              <w:cnfStyle w:val="000000100000" w:firstRow="0" w:lastRow="0" w:firstColumn="0" w:lastColumn="0" w:oddVBand="0" w:evenVBand="0" w:oddHBand="1" w:evenHBand="0" w:firstRowFirstColumn="0" w:firstRowLastColumn="0" w:lastRowFirstColumn="0" w:lastRowLastColumn="0"/>
+            </w:pPr>
+            <w:r>
+              <w:rPr>
+                <w:sz w:val="18"/>
+              </w:rPr>
+              <w:t>local client verifies email, creates Co</w:t>
+            </w:r>
+            <w:r>
+              <w:rPr>
+                <w:sz w:val="18"/>
+              </w:rPr>
+              <w:t>mpany, connects website and resets password</w:t>
+            </w:r>
+          </w:p>
+        </w:tc>
+      </w:tr>
+    </w:tbl>
+    <w:p>
+      <w:pPr>
+        <w:spacing w:after="0" w:line="20" w:lineRule="exact"/>
+      </w:pPr>
     </w:p>
     <w:sectPr>
       <w:headerReference w:type="default" r:id="rId12"/>
@@ -15860,7 +16838,7 @@
     <w:autoRedefine/>
     <w:uiPriority w:val="39"/>
     <w:unhideWhenUsed/>
-    <w:rsid w:val="00D1125A"/>
+    <w:rsid w:val="0042492A"/>
     <w:pPr>
       <w:spacing w:after="100"/>
     </w:pPr>
@@ -15870,7 +16848,7 @@
     <w:basedOn w:val="DefaultParagraphFont"/>
     <w:uiPriority w:val="99"/>
     <w:unhideWhenUsed/>
-    <w:rsid w:val="00D1125A"/>
+    <w:rsid w:val="0042492A"/>
     <w:rPr>
       <w:color w:val="0000FF" w:themeColor="hyperlink"/>
       <w:u w:val="single"/>

</xml_diff>